<commit_message>
Use the Amadeus NDC product name consistently and tidy landing page labels
Rename across README, docs, prompts, config, admin UI and the Word/PDF guide. Landing page: shorter page titles, dedicated section label style, unused styles removed, shorter panel headings.
</commit_message>
<xml_diff>
--- a/docs/Amadeus-Fare-Rules-Amenities-AI-Switch-Guide.docx
+++ b/docs/Amadeus-Fare-Rules-Amenities-AI-Switch-Guide.docx
@@ -17,7 +17,7 @@
           <w:noProof/>
         </w:rPr>
         <w:drawing>
-          <wp:inline distT="0" distB="0" distL="0" distR="0" wp14:anchorId="7FFABDCB" wp14:editId="51501266">
+          <wp:inline distT="0" distB="0" distL="0" distR="0" wp14:anchorId="25347478" wp14:editId="6864EAE5">
             <wp:extent cx="1905000" cy="266700"/>
             <wp:effectExtent l="0" t="0" r="0" b="0"/>
             <wp:docPr id="1" name="Picture 1"/>
@@ -69,7 +69,7 @@
           <w:sz w:val="60"/>
           <w:szCs w:val="60"/>
         </w:rPr>
-        <w:t>Amadeus Fare Rules &amp; Amenities</w:t>
+        <w:t>Amadeus NDC Fare Rules &amp; Amenities</w:t>
       </w:r>
     </w:p>
     <w:p>
@@ -175,14 +175,13 @@
           <w:sz w:val="40"/>
           <w:szCs w:val="40"/>
         </w:rPr>
-        <w:lastRenderedPageBreak/>
         <w:t>Contents</w:t>
       </w:r>
     </w:p>
     <w:sdt>
       <w:sdtPr>
         <w:alias w:val="Contents"/>
-        <w:id w:val="1129595036"/>
+        <w:id w:val="1738275837"/>
       </w:sdtPr>
       <w:sdtEndPr/>
       <w:sdtContent>
@@ -211,7 +210,7 @@
           <w:r>
             <w:fldChar w:fldCharType="separate"/>
           </w:r>
-          <w:hyperlink w:anchor="_Toc241918808" w:history="1">
+          <w:hyperlink w:anchor="_Toc242095235" w:history="1">
             <w:r>
               <w:rPr>
                 <w:rStyle w:val="Hyperlink"/>
@@ -235,7 +234,7 @@
               <w:rPr>
                 <w:noProof/>
               </w:rPr>
-              <w:instrText xml:space="preserve"> PAGEREF _Toc241918808 \h </w:instrText>
+              <w:instrText xml:space="preserve"> PAGEREF _Toc242095235 \h </w:instrText>
             </w:r>
             <w:r>
               <w:rPr>
@@ -278,13 +277,13 @@
               <w14:ligatures w14:val="standardContextual"/>
             </w:rPr>
           </w:pPr>
-          <w:hyperlink w:anchor="_Toc241918809" w:history="1">
+          <w:hyperlink w:anchor="_Toc242095236" w:history="1">
             <w:r>
               <w:rPr>
                 <w:rStyle w:val="Hyperlink"/>
                 <w:noProof/>
               </w:rPr>
-              <w:t>1.1 Why Amadeus Fare Rules &amp; Amenities AI Switch</w:t>
+              <w:t>1.1 Why Amadeus NDC Fare Rules &amp; Amenities AI Switch</w:t>
             </w:r>
             <w:r>
               <w:rPr>
@@ -302,7 +301,7 @@
               <w:rPr>
                 <w:noProof/>
               </w:rPr>
-              <w:instrText xml:space="preserve"> PAGEREF _Toc241918809 \h </w:instrText>
+              <w:instrText xml:space="preserve"> PAGEREF _Toc242095236 \h </w:instrText>
             </w:r>
             <w:r>
               <w:rPr>
@@ -345,7 +344,7 @@
               <w14:ligatures w14:val="standardContextual"/>
             </w:rPr>
           </w:pPr>
-          <w:hyperlink w:anchor="_Toc241918810" w:history="1">
+          <w:hyperlink w:anchor="_Toc242095237" w:history="1">
             <w:r>
               <w:rPr>
                 <w:rStyle w:val="Hyperlink"/>
@@ -369,7 +368,7 @@
               <w:rPr>
                 <w:noProof/>
               </w:rPr>
-              <w:instrText xml:space="preserve"> PAGEREF _Toc241918810 \h </w:instrText>
+              <w:instrText xml:space="preserve"> PAGEREF _Toc242095237 \h </w:instrText>
             </w:r>
             <w:r>
               <w:rPr>
@@ -412,7 +411,7 @@
               <w14:ligatures w14:val="standardContextual"/>
             </w:rPr>
           </w:pPr>
-          <w:hyperlink w:anchor="_Toc241918811" w:history="1">
+          <w:hyperlink w:anchor="_Toc242095238" w:history="1">
             <w:r>
               <w:rPr>
                 <w:rStyle w:val="Hyperlink"/>
@@ -436,7 +435,7 @@
               <w:rPr>
                 <w:noProof/>
               </w:rPr>
-              <w:instrText xml:space="preserve"> PAGEREF _Toc241918811 \h </w:instrText>
+              <w:instrText xml:space="preserve"> PAGEREF _Toc242095238 \h </w:instrText>
             </w:r>
             <w:r>
               <w:rPr>
@@ -479,7 +478,7 @@
               <w14:ligatures w14:val="standardContextual"/>
             </w:rPr>
           </w:pPr>
-          <w:hyperlink w:anchor="_Toc241918812" w:history="1">
+          <w:hyperlink w:anchor="_Toc242095239" w:history="1">
             <w:r>
               <w:rPr>
                 <w:rStyle w:val="Hyperlink"/>
@@ -503,7 +502,7 @@
               <w:rPr>
                 <w:noProof/>
               </w:rPr>
-              <w:instrText xml:space="preserve"> PAGEREF _Toc241918812 \h </w:instrText>
+              <w:instrText xml:space="preserve"> PAGEREF _Toc242095239 \h </w:instrText>
             </w:r>
             <w:r>
               <w:rPr>
@@ -546,7 +545,7 @@
               <w14:ligatures w14:val="standardContextual"/>
             </w:rPr>
           </w:pPr>
-          <w:hyperlink w:anchor="_Toc241918813" w:history="1">
+          <w:hyperlink w:anchor="_Toc242095240" w:history="1">
             <w:r>
               <w:rPr>
                 <w:rStyle w:val="Hyperlink"/>
@@ -570,7 +569,7 @@
               <w:rPr>
                 <w:noProof/>
               </w:rPr>
-              <w:instrText xml:space="preserve"> PAGEREF _Toc241918813 \h </w:instrText>
+              <w:instrText xml:space="preserve"> PAGEREF _Toc242095240 \h </w:instrText>
             </w:r>
             <w:r>
               <w:rPr>
@@ -613,7 +612,7 @@
               <w14:ligatures w14:val="standardContextual"/>
             </w:rPr>
           </w:pPr>
-          <w:hyperlink w:anchor="_Toc241918814" w:history="1">
+          <w:hyperlink w:anchor="_Toc242095241" w:history="1">
             <w:r>
               <w:rPr>
                 <w:rStyle w:val="Hyperlink"/>
@@ -637,7 +636,7 @@
               <w:rPr>
                 <w:noProof/>
               </w:rPr>
-              <w:instrText xml:space="preserve"> PAGEREF _Toc241918814 \h </w:instrText>
+              <w:instrText xml:space="preserve"> PAGEREF _Toc242095241 \h </w:instrText>
             </w:r>
             <w:r>
               <w:rPr>
@@ -680,7 +679,7 @@
               <w14:ligatures w14:val="standardContextual"/>
             </w:rPr>
           </w:pPr>
-          <w:hyperlink w:anchor="_Toc241918815" w:history="1">
+          <w:hyperlink w:anchor="_Toc242095242" w:history="1">
             <w:r>
               <w:rPr>
                 <w:rStyle w:val="Hyperlink"/>
@@ -704,7 +703,7 @@
               <w:rPr>
                 <w:noProof/>
               </w:rPr>
-              <w:instrText xml:space="preserve"> PAGEREF _Toc241918815 \h </w:instrText>
+              <w:instrText xml:space="preserve"> PAGEREF _Toc242095242 \h </w:instrText>
             </w:r>
             <w:r>
               <w:rPr>
@@ -747,7 +746,7 @@
               <w14:ligatures w14:val="standardContextual"/>
             </w:rPr>
           </w:pPr>
-          <w:hyperlink w:anchor="_Toc241918816" w:history="1">
+          <w:hyperlink w:anchor="_Toc242095243" w:history="1">
             <w:r>
               <w:rPr>
                 <w:rStyle w:val="Hyperlink"/>
@@ -771,7 +770,7 @@
               <w:rPr>
                 <w:noProof/>
               </w:rPr>
-              <w:instrText xml:space="preserve"> PAGEREF _Toc241918816 \h </w:instrText>
+              <w:instrText xml:space="preserve"> PAGEREF _Toc242095243 \h </w:instrText>
             </w:r>
             <w:r>
               <w:rPr>
@@ -814,7 +813,7 @@
               <w14:ligatures w14:val="standardContextual"/>
             </w:rPr>
           </w:pPr>
-          <w:hyperlink w:anchor="_Toc241918817" w:history="1">
+          <w:hyperlink w:anchor="_Toc242095244" w:history="1">
             <w:r>
               <w:rPr>
                 <w:rStyle w:val="Hyperlink"/>
@@ -838,7 +837,7 @@
               <w:rPr>
                 <w:noProof/>
               </w:rPr>
-              <w:instrText xml:space="preserve"> PAGEREF _Toc241918817 \h </w:instrText>
+              <w:instrText xml:space="preserve"> PAGEREF _Toc242095244 \h </w:instrText>
             </w:r>
             <w:r>
               <w:rPr>
@@ -881,7 +880,7 @@
               <w14:ligatures w14:val="standardContextual"/>
             </w:rPr>
           </w:pPr>
-          <w:hyperlink w:anchor="_Toc241918818" w:history="1">
+          <w:hyperlink w:anchor="_Toc242095245" w:history="1">
             <w:r>
               <w:rPr>
                 <w:rStyle w:val="Hyperlink"/>
@@ -905,7 +904,7 @@
               <w:rPr>
                 <w:noProof/>
               </w:rPr>
-              <w:instrText xml:space="preserve"> PAGEREF _Toc241918818 \h </w:instrText>
+              <w:instrText xml:space="preserve"> PAGEREF _Toc242095245 \h </w:instrText>
             </w:r>
             <w:r>
               <w:rPr>
@@ -948,7 +947,7 @@
               <w14:ligatures w14:val="standardContextual"/>
             </w:rPr>
           </w:pPr>
-          <w:hyperlink w:anchor="_Toc241918819" w:history="1">
+          <w:hyperlink w:anchor="_Toc242095246" w:history="1">
             <w:r>
               <w:rPr>
                 <w:rStyle w:val="Hyperlink"/>
@@ -972,7 +971,7 @@
               <w:rPr>
                 <w:noProof/>
               </w:rPr>
-              <w:instrText xml:space="preserve"> PAGEREF _Toc241918819 \h </w:instrText>
+              <w:instrText xml:space="preserve"> PAGEREF _Toc242095246 \h </w:instrText>
             </w:r>
             <w:r>
               <w:rPr>
@@ -1015,7 +1014,7 @@
               <w14:ligatures w14:val="standardContextual"/>
             </w:rPr>
           </w:pPr>
-          <w:hyperlink w:anchor="_Toc241918820" w:history="1">
+          <w:hyperlink w:anchor="_Toc242095247" w:history="1">
             <w:r>
               <w:rPr>
                 <w:rStyle w:val="Hyperlink"/>
@@ -1039,7 +1038,7 @@
               <w:rPr>
                 <w:noProof/>
               </w:rPr>
-              <w:instrText xml:space="preserve"> PAGEREF _Toc241918820 \h </w:instrText>
+              <w:instrText xml:space="preserve"> PAGEREF _Toc242095247 \h </w:instrText>
             </w:r>
             <w:r>
               <w:rPr>
@@ -1082,7 +1081,7 @@
               <w14:ligatures w14:val="standardContextual"/>
             </w:rPr>
           </w:pPr>
-          <w:hyperlink w:anchor="_Toc241918821" w:history="1">
+          <w:hyperlink w:anchor="_Toc242095248" w:history="1">
             <w:r>
               <w:rPr>
                 <w:rStyle w:val="Hyperlink"/>
@@ -1106,7 +1105,7 @@
               <w:rPr>
                 <w:noProof/>
               </w:rPr>
-              <w:instrText xml:space="preserve"> PAGEREF _Toc241918821 \h </w:instrText>
+              <w:instrText xml:space="preserve"> PAGEREF _Toc242095248 \h </w:instrText>
             </w:r>
             <w:r>
               <w:rPr>
@@ -1149,7 +1148,7 @@
               <w14:ligatures w14:val="standardContextual"/>
             </w:rPr>
           </w:pPr>
-          <w:hyperlink w:anchor="_Toc241918822" w:history="1">
+          <w:hyperlink w:anchor="_Toc242095249" w:history="1">
             <w:r>
               <w:rPr>
                 <w:rStyle w:val="Hyperlink"/>
@@ -1173,7 +1172,7 @@
               <w:rPr>
                 <w:noProof/>
               </w:rPr>
-              <w:instrText xml:space="preserve"> PAGEREF _Toc241918822 \h </w:instrText>
+              <w:instrText xml:space="preserve"> PAGEREF _Toc242095249 \h </w:instrText>
             </w:r>
             <w:r>
               <w:rPr>
@@ -1216,7 +1215,7 @@
               <w14:ligatures w14:val="standardContextual"/>
             </w:rPr>
           </w:pPr>
-          <w:hyperlink w:anchor="_Toc241918823" w:history="1">
+          <w:hyperlink w:anchor="_Toc242095250" w:history="1">
             <w:r>
               <w:rPr>
                 <w:rStyle w:val="Hyperlink"/>
@@ -1240,7 +1239,7 @@
               <w:rPr>
                 <w:noProof/>
               </w:rPr>
-              <w:instrText xml:space="preserve"> PAGEREF _Toc241918823 \h </w:instrText>
+              <w:instrText xml:space="preserve"> PAGEREF _Toc242095250 \h </w:instrText>
             </w:r>
             <w:r>
               <w:rPr>
@@ -1283,7 +1282,7 @@
               <w14:ligatures w14:val="standardContextual"/>
             </w:rPr>
           </w:pPr>
-          <w:hyperlink w:anchor="_Toc241918824" w:history="1">
+          <w:hyperlink w:anchor="_Toc242095251" w:history="1">
             <w:r>
               <w:rPr>
                 <w:rStyle w:val="Hyperlink"/>
@@ -1307,7 +1306,7 @@
               <w:rPr>
                 <w:noProof/>
               </w:rPr>
-              <w:instrText xml:space="preserve"> PAGEREF _Toc241918824 \h </w:instrText>
+              <w:instrText xml:space="preserve"> PAGEREF _Toc242095251 \h </w:instrText>
             </w:r>
             <w:r>
               <w:rPr>
@@ -1350,7 +1349,7 @@
               <w14:ligatures w14:val="standardContextual"/>
             </w:rPr>
           </w:pPr>
-          <w:hyperlink w:anchor="_Toc241918825" w:history="1">
+          <w:hyperlink w:anchor="_Toc242095252" w:history="1">
             <w:r>
               <w:rPr>
                 <w:rStyle w:val="Hyperlink"/>
@@ -1374,7 +1373,7 @@
               <w:rPr>
                 <w:noProof/>
               </w:rPr>
-              <w:instrText xml:space="preserve"> PAGEREF _Toc241918825 \h </w:instrText>
+              <w:instrText xml:space="preserve"> PAGEREF _Toc242095252 \h </w:instrText>
             </w:r>
             <w:r>
               <w:rPr>
@@ -1417,7 +1416,7 @@
               <w14:ligatures w14:val="standardContextual"/>
             </w:rPr>
           </w:pPr>
-          <w:hyperlink w:anchor="_Toc241918826" w:history="1">
+          <w:hyperlink w:anchor="_Toc242095253" w:history="1">
             <w:r>
               <w:rPr>
                 <w:rStyle w:val="Hyperlink"/>
@@ -1441,7 +1440,7 @@
               <w:rPr>
                 <w:noProof/>
               </w:rPr>
-              <w:instrText xml:space="preserve"> PAGEREF _Toc241918826 \h </w:instrText>
+              <w:instrText xml:space="preserve"> PAGEREF _Toc242095253 \h </w:instrText>
             </w:r>
             <w:r>
               <w:rPr>
@@ -1484,7 +1483,7 @@
               <w14:ligatures w14:val="standardContextual"/>
             </w:rPr>
           </w:pPr>
-          <w:hyperlink w:anchor="_Toc241918827" w:history="1">
+          <w:hyperlink w:anchor="_Toc242095254" w:history="1">
             <w:r>
               <w:rPr>
                 <w:rStyle w:val="Hyperlink"/>
@@ -1508,7 +1507,7 @@
               <w:rPr>
                 <w:noProof/>
               </w:rPr>
-              <w:instrText xml:space="preserve"> PAGEREF _Toc241918827 \h </w:instrText>
+              <w:instrText xml:space="preserve"> PAGEREF _Toc242095254 \h </w:instrText>
             </w:r>
             <w:r>
               <w:rPr>
@@ -1551,7 +1550,7 @@
               <w14:ligatures w14:val="standardContextual"/>
             </w:rPr>
           </w:pPr>
-          <w:hyperlink w:anchor="_Toc241918828" w:history="1">
+          <w:hyperlink w:anchor="_Toc242095255" w:history="1">
             <w:r>
               <w:rPr>
                 <w:rStyle w:val="Hyperlink"/>
@@ -1575,7 +1574,7 @@
               <w:rPr>
                 <w:noProof/>
               </w:rPr>
-              <w:instrText xml:space="preserve"> PAGEREF _Toc241918828 \h </w:instrText>
+              <w:instrText xml:space="preserve"> PAGEREF _Toc242095255 \h </w:instrText>
             </w:r>
             <w:r>
               <w:rPr>
@@ -1618,7 +1617,7 @@
               <w14:ligatures w14:val="standardContextual"/>
             </w:rPr>
           </w:pPr>
-          <w:hyperlink w:anchor="_Toc241918829" w:history="1">
+          <w:hyperlink w:anchor="_Toc242095256" w:history="1">
             <w:r>
               <w:rPr>
                 <w:rStyle w:val="Hyperlink"/>
@@ -1642,7 +1641,7 @@
               <w:rPr>
                 <w:noProof/>
               </w:rPr>
-              <w:instrText xml:space="preserve"> PAGEREF _Toc241918829 \h </w:instrText>
+              <w:instrText xml:space="preserve"> PAGEREF _Toc242095256 \h </w:instrText>
             </w:r>
             <w:r>
               <w:rPr>
@@ -1685,7 +1684,7 @@
               <w14:ligatures w14:val="standardContextual"/>
             </w:rPr>
           </w:pPr>
-          <w:hyperlink w:anchor="_Toc241918830" w:history="1">
+          <w:hyperlink w:anchor="_Toc242095257" w:history="1">
             <w:r>
               <w:rPr>
                 <w:rStyle w:val="Hyperlink"/>
@@ -1709,7 +1708,7 @@
               <w:rPr>
                 <w:noProof/>
               </w:rPr>
-              <w:instrText xml:space="preserve"> PAGEREF _Toc241918830 \h </w:instrText>
+              <w:instrText xml:space="preserve"> PAGEREF _Toc242095257 \h </w:instrText>
             </w:r>
             <w:r>
               <w:rPr>
@@ -1752,7 +1751,7 @@
               <w14:ligatures w14:val="standardContextual"/>
             </w:rPr>
           </w:pPr>
-          <w:hyperlink w:anchor="_Toc241918831" w:history="1">
+          <w:hyperlink w:anchor="_Toc242095258" w:history="1">
             <w:r>
               <w:rPr>
                 <w:rStyle w:val="Hyperlink"/>
@@ -1776,7 +1775,7 @@
               <w:rPr>
                 <w:noProof/>
               </w:rPr>
-              <w:instrText xml:space="preserve"> PAGEREF _Toc241918831 \h </w:instrText>
+              <w:instrText xml:space="preserve"> PAGEREF _Toc242095258 \h </w:instrText>
             </w:r>
             <w:r>
               <w:rPr>
@@ -1819,7 +1818,7 @@
               <w14:ligatures w14:val="standardContextual"/>
             </w:rPr>
           </w:pPr>
-          <w:hyperlink w:anchor="_Toc241918832" w:history="1">
+          <w:hyperlink w:anchor="_Toc242095259" w:history="1">
             <w:r>
               <w:rPr>
                 <w:rStyle w:val="Hyperlink"/>
@@ -1843,7 +1842,7 @@
               <w:rPr>
                 <w:noProof/>
               </w:rPr>
-              <w:instrText xml:space="preserve"> PAGEREF _Toc241918832 \h </w:instrText>
+              <w:instrText xml:space="preserve"> PAGEREF _Toc242095259 \h </w:instrText>
             </w:r>
             <w:r>
               <w:rPr>
@@ -1886,7 +1885,7 @@
               <w14:ligatures w14:val="standardContextual"/>
             </w:rPr>
           </w:pPr>
-          <w:hyperlink w:anchor="_Toc241918833" w:history="1">
+          <w:hyperlink w:anchor="_Toc242095260" w:history="1">
             <w:r>
               <w:rPr>
                 <w:rStyle w:val="Hyperlink"/>
@@ -1910,7 +1909,7 @@
               <w:rPr>
                 <w:noProof/>
               </w:rPr>
-              <w:instrText xml:space="preserve"> PAGEREF _Toc241918833 \h </w:instrText>
+              <w:instrText xml:space="preserve"> PAGEREF _Toc242095260 \h </w:instrText>
             </w:r>
             <w:r>
               <w:rPr>
@@ -1953,7 +1952,7 @@
               <w14:ligatures w14:val="standardContextual"/>
             </w:rPr>
           </w:pPr>
-          <w:hyperlink w:anchor="_Toc241918834" w:history="1">
+          <w:hyperlink w:anchor="_Toc242095261" w:history="1">
             <w:r>
               <w:rPr>
                 <w:rStyle w:val="Hyperlink"/>
@@ -1977,7 +1976,7 @@
               <w:rPr>
                 <w:noProof/>
               </w:rPr>
-              <w:instrText xml:space="preserve"> PAGEREF _Toc241918834 \h </w:instrText>
+              <w:instrText xml:space="preserve"> PAGEREF _Toc242095261 \h </w:instrText>
             </w:r>
             <w:r>
               <w:rPr>
@@ -2020,7 +2019,7 @@
               <w14:ligatures w14:val="standardContextual"/>
             </w:rPr>
           </w:pPr>
-          <w:hyperlink w:anchor="_Toc241918835" w:history="1">
+          <w:hyperlink w:anchor="_Toc242095262" w:history="1">
             <w:r>
               <w:rPr>
                 <w:rStyle w:val="Hyperlink"/>
@@ -2044,7 +2043,7 @@
               <w:rPr>
                 <w:noProof/>
               </w:rPr>
-              <w:instrText xml:space="preserve"> PAGEREF _Toc241918835 \h </w:instrText>
+              <w:instrText xml:space="preserve"> PAGEREF _Toc242095262 \h </w:instrText>
             </w:r>
             <w:r>
               <w:rPr>
@@ -2087,7 +2086,7 @@
               <w14:ligatures w14:val="standardContextual"/>
             </w:rPr>
           </w:pPr>
-          <w:hyperlink w:anchor="_Toc241918836" w:history="1">
+          <w:hyperlink w:anchor="_Toc242095263" w:history="1">
             <w:r>
               <w:rPr>
                 <w:rStyle w:val="Hyperlink"/>
@@ -2111,7 +2110,7 @@
               <w:rPr>
                 <w:noProof/>
               </w:rPr>
-              <w:instrText xml:space="preserve"> PAGEREF _Toc241918836 \h </w:instrText>
+              <w:instrText xml:space="preserve"> PAGEREF _Toc242095263 \h </w:instrText>
             </w:r>
             <w:r>
               <w:rPr>
@@ -2154,7 +2153,7 @@
               <w14:ligatures w14:val="standardContextual"/>
             </w:rPr>
           </w:pPr>
-          <w:hyperlink w:anchor="_Toc241918837" w:history="1">
+          <w:hyperlink w:anchor="_Toc242095264" w:history="1">
             <w:r>
               <w:rPr>
                 <w:rStyle w:val="Hyperlink"/>
@@ -2178,7 +2177,7 @@
               <w:rPr>
                 <w:noProof/>
               </w:rPr>
-              <w:instrText xml:space="preserve"> PAGEREF _Toc241918837 \h </w:instrText>
+              <w:instrText xml:space="preserve"> PAGEREF _Toc242095264 \h </w:instrText>
             </w:r>
             <w:r>
               <w:rPr>
@@ -2221,7 +2220,7 @@
               <w14:ligatures w14:val="standardContextual"/>
             </w:rPr>
           </w:pPr>
-          <w:hyperlink w:anchor="_Toc241918838" w:history="1">
+          <w:hyperlink w:anchor="_Toc242095265" w:history="1">
             <w:r>
               <w:rPr>
                 <w:rStyle w:val="Hyperlink"/>
@@ -2245,7 +2244,7 @@
               <w:rPr>
                 <w:noProof/>
               </w:rPr>
-              <w:instrText xml:space="preserve"> PAGEREF _Toc241918838 \h </w:instrText>
+              <w:instrText xml:space="preserve"> PAGEREF _Toc242095265 \h </w:instrText>
             </w:r>
             <w:r>
               <w:rPr>
@@ -2288,7 +2287,7 @@
               <w14:ligatures w14:val="standardContextual"/>
             </w:rPr>
           </w:pPr>
-          <w:hyperlink w:anchor="_Toc241918839" w:history="1">
+          <w:hyperlink w:anchor="_Toc242095266" w:history="1">
             <w:r>
               <w:rPr>
                 <w:rStyle w:val="Hyperlink"/>
@@ -2312,7 +2311,7 @@
               <w:rPr>
                 <w:noProof/>
               </w:rPr>
-              <w:instrText xml:space="preserve"> PAGEREF _Toc241918839 \h </w:instrText>
+              <w:instrText xml:space="preserve"> PAGEREF _Toc242095266 \h </w:instrText>
             </w:r>
             <w:r>
               <w:rPr>
@@ -2355,13 +2354,13 @@
               <w14:ligatures w14:val="standardContextual"/>
             </w:rPr>
           </w:pPr>
-          <w:hyperlink w:anchor="_Toc241918840" w:history="1">
+          <w:hyperlink w:anchor="_Toc242095267" w:history="1">
             <w:r>
               <w:rPr>
                 <w:rStyle w:val="Hyperlink"/>
                 <w:noProof/>
               </w:rPr>
-              <w:t>6.4 What Amadeus Fare Rules &amp; Amenities AI Switch stores</w:t>
+              <w:t>6.4 What Amadeus NDC Fare Rules &amp; Amenities AI Switch stores</w:t>
             </w:r>
             <w:r>
               <w:rPr>
@@ -2379,7 +2378,7 @@
               <w:rPr>
                 <w:noProof/>
               </w:rPr>
-              <w:instrText xml:space="preserve"> PAGEREF _Toc241918840 \h </w:instrText>
+              <w:instrText xml:space="preserve"> PAGEREF _Toc242095267 \h </w:instrText>
             </w:r>
             <w:r>
               <w:rPr>
@@ -2422,7 +2421,7 @@
               <w14:ligatures w14:val="standardContextual"/>
             </w:rPr>
           </w:pPr>
-          <w:hyperlink w:anchor="_Toc241918841" w:history="1">
+          <w:hyperlink w:anchor="_Toc242095268" w:history="1">
             <w:r>
               <w:rPr>
                 <w:rStyle w:val="Hyperlink"/>
@@ -2446,7 +2445,7 @@
               <w:rPr>
                 <w:noProof/>
               </w:rPr>
-              <w:instrText xml:space="preserve"> PAGEREF _Toc241918841 \h </w:instrText>
+              <w:instrText xml:space="preserve"> PAGEREF _Toc242095268 \h </w:instrText>
             </w:r>
             <w:r>
               <w:rPr>
@@ -2486,9 +2485,8 @@
         <w:keepNext/>
         <w:pageBreakBefore/>
       </w:pPr>
-      <w:bookmarkStart w:id="0" w:name="_Toc241918808"/>
-      <w:r>
-        <w:lastRenderedPageBreak/>
+      <w:bookmarkStart w:id="0" w:name="_Toc242095235"/>
+      <w:r>
         <w:t>1. Introduction</w:t>
       </w:r>
       <w:bookmarkEnd w:id="0"/>
@@ -2498,9 +2496,9 @@
         <w:pStyle w:val="Heading2"/>
         <w:keepNext/>
       </w:pPr>
-      <w:bookmarkStart w:id="1" w:name="_Toc241918809"/>
-      <w:r>
-        <w:t>1.1 Why Amadeus Fare Rules &amp; Amenities AI Switch</w:t>
+      <w:bookmarkStart w:id="1" w:name="_Toc242095236"/>
+      <w:r>
+        <w:t>1.1 Why Amadeus NDC Fare Rules &amp; Amenities AI Switch</w:t>
       </w:r>
       <w:bookmarkEnd w:id="1"/>
     </w:p>
@@ -2571,7 +2569,7 @@
         <w:t>what does it cost me to cancel or change?</w:t>
       </w:r>
       <w:r>
-        <w:t xml:space="preserve"> Amadeus Fare Rules &amp; Amenities AI Switch answers that in plain language, in the traveller's own language, formatted for desktop or mobile — and caches the result so repeated fare rules cost zero tokens.</w:t>
+        <w:t xml:space="preserve"> Amadeus NDC Fare Rules &amp; Amenities AI Switch answers that in plain language, in the traveller's own language, formatted for desktop or mobile — and caches the result so repeated fare rules cost zero tokens.</w:t>
       </w:r>
     </w:p>
     <w:p>
@@ -2579,7 +2577,7 @@
         <w:spacing w:after="120"/>
       </w:pPr>
       <w:r>
-        <w:t>Amadeus Fare Rules &amp; Amenities AI Switch was built by TravelSwitch, where it powers fare-rule explanations in production booking flows, and is shared with the travel-tech community so any airline, OTA or travel-tech team can run it on their own stack.</w:t>
+        <w:t>Amadeus NDC Fare Rules &amp; Amenities AI Switch was built by TravelSwitch, where it powers fare-rule explanations in production booking flows, and is shared with the travel-tech community so any airline, OTA or travel-tech team can run it on their own stack.</w:t>
       </w:r>
     </w:p>
     <w:p>
@@ -2684,7 +2682,7 @@
         <w:spacing w:before="120" w:after="120"/>
       </w:pPr>
       <w:r>
-        <w:t>Amadeus Fare Rules &amp; Amenities AI Switch is that solution. Feed it whatever the airline returned and get back a consistent, short, structured summary, plus a Q&amp;A channel for the follow-up questions travellers actually ask.</w:t>
+        <w:t>Amadeus NDC Fare Rules &amp; Amenities AI Switch is that solution. Feed it whatever the airline returned and get back a consistent, short, structured summary, plus a Q&amp;A channel for the follow-up questions travellers actually ask.</w:t>
       </w:r>
     </w:p>
     <w:p>
@@ -2692,7 +2690,7 @@
         <w:spacing w:after="120"/>
       </w:pPr>
       <w:r>
-        <w:t>Amadeus Fare Rules &amp; Amenities AI Switch is that solution for both halves of the fare-family payload: the rules and the amenity list, plus friendly fare-family names.</w:t>
+        <w:t>Amadeus NDC Fare Rules &amp; Amenities AI Switch is that solution for both halves of the fare-family payload: the rules and the amenity list, plus friendly fare-family names.</w:t>
       </w:r>
     </w:p>
     <w:p>
@@ -2700,7 +2698,7 @@
         <w:pStyle w:val="Heading2"/>
         <w:keepNext/>
       </w:pPr>
-      <w:bookmarkStart w:id="2" w:name="_Toc241918810"/>
+      <w:bookmarkStart w:id="2" w:name="_Toc242095237"/>
       <w:r>
         <w:t>1.2 What you get</w:t>
       </w:r>
@@ -3329,9 +3327,8 @@
         <w:pStyle w:val="Heading2"/>
         <w:keepNext/>
       </w:pPr>
-      <w:bookmarkStart w:id="3" w:name="_Toc241918811"/>
-      <w:r>
-        <w:lastRenderedPageBreak/>
+      <w:bookmarkStart w:id="3" w:name="_Toc242095238"/>
+      <w:r>
         <w:t>1.3 The admin interface at a glance</w:t>
       </w:r>
       <w:bookmarkEnd w:id="3"/>
@@ -3347,10 +3344,10 @@
           <w:noProof/>
         </w:rPr>
         <w:drawing>
-          <wp:inline distT="0" distB="0" distL="0" distR="0" wp14:anchorId="07DEC46D" wp14:editId="08223642">
+          <wp:inline distT="0" distB="0" distL="0" distR="0" wp14:anchorId="02944217" wp14:editId="0CB8193E">
             <wp:extent cx="6400800" cy="4000500"/>
             <wp:effectExtent l="0" t="0" r="0" b="0"/>
-            <wp:docPr id="133114594" name="Picture 133114594"/>
+            <wp:docPr id="521113998" name="Picture 521113998"/>
             <wp:cNvGraphicFramePr>
               <a:graphicFrameLocks xmlns:a="http://schemas.openxmlformats.org/drawingml/2006/main" noChangeAspect="1"/>
             </wp:cNvGraphicFramePr>
@@ -3408,9 +3405,8 @@
         <w:keepNext/>
         <w:pageBreakBefore/>
       </w:pPr>
-      <w:bookmarkStart w:id="4" w:name="_Toc241918812"/>
-      <w:r>
-        <w:lastRenderedPageBreak/>
+      <w:bookmarkStart w:id="4" w:name="_Toc242095239"/>
+      <w:r>
         <w:t>2. Quick start</w:t>
       </w:r>
       <w:bookmarkEnd w:id="4"/>
@@ -3428,7 +3424,7 @@
         <w:pStyle w:val="Heading2"/>
         <w:keepNext/>
       </w:pPr>
-      <w:bookmarkStart w:id="5" w:name="_Toc241918813"/>
+      <w:bookmarkStart w:id="5" w:name="_Toc242095240"/>
       <w:r>
         <w:t>2.1 Run it</w:t>
       </w:r>
@@ -3533,7 +3529,7 @@
         <w:pStyle w:val="Heading2"/>
         <w:keepNext/>
       </w:pPr>
-      <w:bookmarkStart w:id="6" w:name="_Toc241918814"/>
+      <w:bookmarkStart w:id="6" w:name="_Toc242095241"/>
       <w:r>
         <w:t>2.2 Choose an LLM provider</w:t>
       </w:r>
@@ -3578,10 +3574,10 @@
           <w:noProof/>
         </w:rPr>
         <w:drawing>
-          <wp:inline distT="0" distB="0" distL="0" distR="0" wp14:anchorId="23883F58" wp14:editId="3CF2E3BE">
+          <wp:inline distT="0" distB="0" distL="0" distR="0" wp14:anchorId="0DAD0B70" wp14:editId="429C7CBA">
             <wp:extent cx="6400800" cy="4000500"/>
             <wp:effectExtent l="0" t="0" r="0" b="0"/>
-            <wp:docPr id="2075079730" name="Picture 2075079730"/>
+            <wp:docPr id="1998705984" name="Picture 1998705984"/>
             <wp:cNvGraphicFramePr>
               <a:graphicFrameLocks xmlns:a="http://schemas.openxmlformats.org/drawingml/2006/main" noChangeAspect="1"/>
             </wp:cNvGraphicFramePr>
@@ -3638,7 +3634,7 @@
         <w:pStyle w:val="Heading2"/>
         <w:keepNext/>
       </w:pPr>
-      <w:bookmarkStart w:id="7" w:name="_Toc241918815"/>
+      <w:bookmarkStart w:id="7" w:name="_Toc242095242"/>
       <w:r>
         <w:t>2.3 Create an API key</w:t>
       </w:r>
@@ -3662,12 +3658,11 @@
         <w:rPr>
           <w:noProof/>
         </w:rPr>
-        <w:lastRenderedPageBreak/>
         <w:drawing>
-          <wp:inline distT="0" distB="0" distL="0" distR="0" wp14:anchorId="4D17C285" wp14:editId="238E41A2">
+          <wp:inline distT="0" distB="0" distL="0" distR="0" wp14:anchorId="0869CD3E" wp14:editId="5DF38143">
             <wp:extent cx="6400800" cy="4000500"/>
             <wp:effectExtent l="0" t="0" r="0" b="0"/>
-            <wp:docPr id="521771103" name="Picture 521771103"/>
+            <wp:docPr id="453056715" name="Picture 453056715"/>
             <wp:cNvGraphicFramePr>
               <a:graphicFrameLocks xmlns:a="http://schemas.openxmlformats.org/drawingml/2006/main" noChangeAspect="1"/>
             </wp:cNvGraphicFramePr>
@@ -3724,7 +3719,7 @@
         <w:pStyle w:val="Heading2"/>
         <w:keepNext/>
       </w:pPr>
-      <w:bookmarkStart w:id="8" w:name="_Toc241918816"/>
+      <w:bookmarkStart w:id="8" w:name="_Toc242095243"/>
       <w:r>
         <w:t>2.4 Call the API</w:t>
       </w:r>
@@ -3818,7 +3813,7 @@
         <w:pStyle w:val="Heading2"/>
         <w:keepNext/>
       </w:pPr>
-      <w:bookmarkStart w:id="9" w:name="_Toc241918817"/>
+      <w:bookmarkStart w:id="9" w:name="_Toc242095244"/>
       <w:r>
         <w:t>2.5 Try it in the Playground</w:t>
       </w:r>
@@ -3842,12 +3837,11 @@
         <w:rPr>
           <w:noProof/>
         </w:rPr>
-        <w:lastRenderedPageBreak/>
         <w:drawing>
-          <wp:inline distT="0" distB="0" distL="0" distR="0" wp14:anchorId="2378AB1C" wp14:editId="6749210B">
+          <wp:inline distT="0" distB="0" distL="0" distR="0" wp14:anchorId="61B2DAF4" wp14:editId="2586A6E6">
             <wp:extent cx="6400800" cy="4000500"/>
             <wp:effectExtent l="0" t="0" r="0" b="0"/>
-            <wp:docPr id="637433334" name="Picture 637433334"/>
+            <wp:docPr id="40682468" name="Picture 40682468"/>
             <wp:cNvGraphicFramePr>
               <a:graphicFrameLocks xmlns:a="http://schemas.openxmlformats.org/drawingml/2006/main" noChangeAspect="1"/>
             </wp:cNvGraphicFramePr>
@@ -3910,10 +3904,10 @@
           <w:noProof/>
         </w:rPr>
         <w:drawing>
-          <wp:inline distT="0" distB="0" distL="0" distR="0" wp14:anchorId="7B8594F5" wp14:editId="4EB085C5">
+          <wp:inline distT="0" distB="0" distL="0" distR="0" wp14:anchorId="39BD7A61" wp14:editId="350CB740">
             <wp:extent cx="6400800" cy="4000500"/>
             <wp:effectExtent l="0" t="0" r="0" b="0"/>
-            <wp:docPr id="2069750222" name="Picture 2069750222"/>
+            <wp:docPr id="316402974" name="Picture 316402974"/>
             <wp:cNvGraphicFramePr>
               <a:graphicFrameLocks xmlns:a="http://schemas.openxmlformats.org/drawingml/2006/main" noChangeAspect="1"/>
             </wp:cNvGraphicFramePr>
@@ -3970,9 +3964,8 @@
         <w:pStyle w:val="Heading2"/>
         <w:keepNext/>
       </w:pPr>
-      <w:bookmarkStart w:id="10" w:name="_Toc241918818"/>
-      <w:r>
-        <w:lastRenderedPageBreak/>
+      <w:bookmarkStart w:id="10" w:name="_Toc242095245"/>
+      <w:r>
         <w:t>2.6 Watch usage</w:t>
       </w:r>
       <w:bookmarkEnd w:id="10"/>
@@ -3996,10 +3989,10 @@
           <w:noProof/>
         </w:rPr>
         <w:drawing>
-          <wp:inline distT="0" distB="0" distL="0" distR="0" wp14:anchorId="6508BFB0" wp14:editId="1BAEBD13">
+          <wp:inline distT="0" distB="0" distL="0" distR="0" wp14:anchorId="43DEEE30" wp14:editId="5A647C68">
             <wp:extent cx="4648200" cy="7429500"/>
             <wp:effectExtent l="0" t="0" r="0" b="0"/>
-            <wp:docPr id="418829255" name="Picture 418829255"/>
+            <wp:docPr id="1348277566" name="Picture 1348277566"/>
             <wp:cNvGraphicFramePr>
               <a:graphicFrameLocks xmlns:a="http://schemas.openxmlformats.org/drawingml/2006/main" noChangeAspect="1"/>
             </wp:cNvGraphicFramePr>
@@ -4057,9 +4050,8 @@
         <w:keepNext/>
         <w:pageBreakBefore/>
       </w:pPr>
-      <w:bookmarkStart w:id="11" w:name="_Toc241918819"/>
-      <w:r>
-        <w:lastRenderedPageBreak/>
+      <w:bookmarkStart w:id="11" w:name="_Toc242095246"/>
+      <w:r>
         <w:t>3. API reference</w:t>
       </w:r>
       <w:bookmarkEnd w:id="11"/>
@@ -4069,7 +4061,7 @@
         <w:pStyle w:val="Heading2"/>
         <w:keepNext/>
       </w:pPr>
-      <w:bookmarkStart w:id="12" w:name="_Toc241918820"/>
+      <w:bookmarkStart w:id="12" w:name="_Toc242095247"/>
       <w:r>
         <w:t>3.1 Authentication and errors</w:t>
       </w:r>
@@ -4777,7 +4769,7 @@
         <w:pStyle w:val="Heading2"/>
         <w:keepNext/>
       </w:pPr>
-      <w:bookmarkStart w:id="13" w:name="_Toc241918821"/>
+      <w:bookmarkStart w:id="13" w:name="_Toc242095248"/>
       <w:r>
         <w:t>3.2 POST /api/v1/fare-rules/summary</w:t>
       </w:r>
@@ -5412,9 +5404,8 @@
         <w:pStyle w:val="Heading2"/>
         <w:keepNext/>
       </w:pPr>
-      <w:bookmarkStart w:id="14" w:name="_Toc241918822"/>
-      <w:r>
-        <w:lastRenderedPageBreak/>
+      <w:bookmarkStart w:id="14" w:name="_Toc242095249"/>
+      <w:r>
         <w:t>3.3 POST /api/v1/fare-rules/chat/stream</w:t>
       </w:r>
       <w:bookmarkEnd w:id="14"/>
@@ -5768,7 +5759,7 @@
         <w:pStyle w:val="Heading2"/>
         <w:keepNext/>
       </w:pPr>
-      <w:bookmarkStart w:id="15" w:name="_Toc241918823"/>
+      <w:bookmarkStart w:id="15" w:name="_Toc242095250"/>
       <w:r>
         <w:t>3.4 Other endpoints</w:t>
       </w:r>
@@ -6116,7 +6107,7 @@
         <w:pStyle w:val="Heading2"/>
         <w:keepNext/>
       </w:pPr>
-      <w:bookmarkStart w:id="16" w:name="_Toc241918824"/>
+      <w:bookmarkStart w:id="16" w:name="_Toc242095251"/>
       <w:r>
         <w:t>3.5 POST /api/v1/amenities/summary</w:t>
       </w:r>
@@ -6187,7 +6178,6 @@
                 <w:sz w:val="19"/>
                 <w:szCs w:val="19"/>
               </w:rPr>
-              <w:lastRenderedPageBreak/>
               <w:t>Field</w:t>
             </w:r>
           </w:p>
@@ -6771,12 +6761,11 @@
         <w:rPr>
           <w:noProof/>
         </w:rPr>
-        <w:lastRenderedPageBreak/>
         <w:drawing>
-          <wp:inline distT="0" distB="0" distL="0" distR="0" wp14:anchorId="1998383A" wp14:editId="7FB1D6FE">
+          <wp:inline distT="0" distB="0" distL="0" distR="0" wp14:anchorId="5C057ADF" wp14:editId="594795BA">
             <wp:extent cx="6400800" cy="4000500"/>
             <wp:effectExtent l="0" t="0" r="0" b="0"/>
-            <wp:docPr id="1639479001" name="Picture 1639479001"/>
+            <wp:docPr id="434310072" name="Picture 434310072"/>
             <wp:cNvGraphicFramePr>
               <a:graphicFrameLocks xmlns:a="http://schemas.openxmlformats.org/drawingml/2006/main" noChangeAspect="1"/>
             </wp:cNvGraphicFramePr>
@@ -6833,7 +6822,7 @@
         <w:pStyle w:val="Heading2"/>
         <w:keepNext/>
       </w:pPr>
-      <w:bookmarkStart w:id="17" w:name="_Toc241918825"/>
+      <w:bookmarkStart w:id="17" w:name="_Toc242095252"/>
       <w:r>
         <w:t>3.6 POST /api/v1/amenities/fare-names</w:t>
       </w:r>
@@ -6892,12 +6881,11 @@
         <w:rPr>
           <w:noProof/>
         </w:rPr>
-        <w:lastRenderedPageBreak/>
         <w:drawing>
-          <wp:inline distT="0" distB="0" distL="0" distR="0" wp14:anchorId="6491CAE1" wp14:editId="4820F646">
+          <wp:inline distT="0" distB="0" distL="0" distR="0" wp14:anchorId="2A47DCCF" wp14:editId="21EEBBAE">
             <wp:extent cx="6400800" cy="4000500"/>
             <wp:effectExtent l="0" t="0" r="0" b="0"/>
-            <wp:docPr id="1045108788" name="Picture 1045108788"/>
+            <wp:docPr id="413608353" name="Picture 413608353"/>
             <wp:cNvGraphicFramePr>
               <a:graphicFrameLocks xmlns:a="http://schemas.openxmlformats.org/drawingml/2006/main" noChangeAspect="1"/>
             </wp:cNvGraphicFramePr>
@@ -6954,7 +6942,7 @@
         <w:pStyle w:val="Heading2"/>
         <w:keepNext/>
       </w:pPr>
-      <w:bookmarkStart w:id="18" w:name="_Toc241918826"/>
+      <w:bookmarkStart w:id="18" w:name="_Toc242095253"/>
       <w:r>
         <w:t>3.7 Interactive documentation (Swagger UI)</w:t>
       </w:r>
@@ -7017,12 +7005,11 @@
         <w:rPr>
           <w:noProof/>
         </w:rPr>
-        <w:lastRenderedPageBreak/>
         <w:drawing>
-          <wp:inline distT="0" distB="0" distL="0" distR="0" wp14:anchorId="3394C1C8" wp14:editId="6CDAF423">
+          <wp:inline distT="0" distB="0" distL="0" distR="0" wp14:anchorId="5EA2CAD1" wp14:editId="264B8E24">
             <wp:extent cx="6400800" cy="7229475"/>
             <wp:effectExtent l="0" t="0" r="0" b="0"/>
-            <wp:docPr id="668504521" name="Picture 668504521"/>
+            <wp:docPr id="794117570" name="Picture 794117570"/>
             <wp:cNvGraphicFramePr>
               <a:graphicFrameLocks xmlns:a="http://schemas.openxmlformats.org/drawingml/2006/main" noChangeAspect="1"/>
             </wp:cNvGraphicFramePr>
@@ -7084,12 +7071,11 @@
         <w:rPr>
           <w:noProof/>
         </w:rPr>
-        <w:lastRenderedPageBreak/>
         <w:drawing>
-          <wp:inline distT="0" distB="0" distL="0" distR="0" wp14:anchorId="26D4E4CB" wp14:editId="5059FFCF">
+          <wp:inline distT="0" distB="0" distL="0" distR="0" wp14:anchorId="3B98C93B" wp14:editId="6F6CA137">
             <wp:extent cx="3886200" cy="7429500"/>
             <wp:effectExtent l="0" t="0" r="0" b="0"/>
-            <wp:docPr id="78157981" name="Picture 78157981"/>
+            <wp:docPr id="968528102" name="Picture 968528102"/>
             <wp:cNvGraphicFramePr>
               <a:graphicFrameLocks xmlns:a="http://schemas.openxmlformats.org/drawingml/2006/main" noChangeAspect="1"/>
             </wp:cNvGraphicFramePr>
@@ -7147,9 +7133,8 @@
         <w:keepNext/>
         <w:pageBreakBefore/>
       </w:pPr>
-      <w:bookmarkStart w:id="19" w:name="_Toc241918827"/>
-      <w:r>
-        <w:lastRenderedPageBreak/>
+      <w:bookmarkStart w:id="19" w:name="_Toc242095254"/>
+      <w:r>
         <w:t>4. Configuration</w:t>
       </w:r>
       <w:bookmarkEnd w:id="19"/>
@@ -7159,7 +7144,7 @@
         <w:spacing w:after="120"/>
       </w:pPr>
       <w:r>
-        <w:t xml:space="preserve">Amadeus Fare Rules &amp; Amenities AI Switch works with zero configuration. Copy </w:t>
+        <w:t xml:space="preserve">Amadeus NDC Fare Rules &amp; Amenities AI Switch works with zero configuration. Copy </w:t>
       </w:r>
       <w:r>
         <w:rPr>
@@ -7193,7 +7178,7 @@
         <w:pStyle w:val="Heading2"/>
         <w:keepNext/>
       </w:pPr>
-      <w:bookmarkStart w:id="20" w:name="_Toc241918828"/>
+      <w:bookmarkStart w:id="20" w:name="_Toc242095255"/>
       <w:r>
         <w:t>4.1 Environment variables</w:t>
       </w:r>
@@ -8434,7 +8419,7 @@
         <w:pStyle w:val="Heading2"/>
         <w:keepNext/>
       </w:pPr>
-      <w:bookmarkStart w:id="21" w:name="_Toc241918829"/>
+      <w:bookmarkStart w:id="21" w:name="_Toc242095256"/>
       <w:r>
         <w:t>4.2 LLM providers</w:t>
       </w:r>
@@ -9095,9 +9080,8 @@
         <w:pStyle w:val="Heading2"/>
         <w:keepNext/>
       </w:pPr>
-      <w:bookmarkStart w:id="22" w:name="_Toc241918830"/>
-      <w:r>
-        <w:lastRenderedPageBreak/>
+      <w:bookmarkStart w:id="22" w:name="_Toc242095257"/>
+      <w:r>
         <w:t>4.3 Using your own Postgres / Redis</w:t>
       </w:r>
       <w:bookmarkEnd w:id="22"/>
@@ -9117,7 +9101,7 @@
         <w:t>Data stores</w:t>
       </w:r>
       <w:r>
-        <w:t xml:space="preserve"> page lets you point Amadeus Fare Rules &amp; Amenities AI Switch at an existing Postgres and/or Redis with plain host / port / user / password fields (or a pasted connection string). It tests the connection, creates the schema, copies users, LLM configuration and API keys if the target is empty, and switches live — no restart. The choice is persisted, encrypted, in the data volume. Redis is optional: without it, summaries are cached in Postgres only and chat context lives in memory (single instance).</w:t>
+        <w:t xml:space="preserve"> page lets you point Amadeus NDC Fare Rules &amp; Amenities AI Switch at an existing Postgres and/or Redis with plain host / port / user / password fields (or a pasted connection string). It tests the connection, creates the schema, copies users, LLM configuration and API keys if the target is empty, and switches live — no restart. The choice is persisted, encrypted, in the data volume. Redis is optional: without it, summaries are cached in Postgres only and chat context lives in memory (single instance).</w:t>
       </w:r>
     </w:p>
     <w:p>
@@ -9131,10 +9115,10 @@
           <w:noProof/>
         </w:rPr>
         <w:drawing>
-          <wp:inline distT="0" distB="0" distL="0" distR="0" wp14:anchorId="27B78DA7" wp14:editId="47C21742">
+          <wp:inline distT="0" distB="0" distL="0" distR="0" wp14:anchorId="3571B171" wp14:editId="65B11CA2">
             <wp:extent cx="6400800" cy="4000500"/>
             <wp:effectExtent l="0" t="0" r="0" b="0"/>
-            <wp:docPr id="1487426257" name="Picture 1487426257"/>
+            <wp:docPr id="1847336136" name="Picture 1847336136"/>
             <wp:cNvGraphicFramePr>
               <a:graphicFrameLocks xmlns:a="http://schemas.openxmlformats.org/drawingml/2006/main" noChangeAspect="1"/>
             </wp:cNvGraphicFramePr>
@@ -9191,7 +9175,7 @@
         <w:pStyle w:val="Heading2"/>
         <w:keepNext/>
       </w:pPr>
-      <w:bookmarkStart w:id="23" w:name="_Toc241918831"/>
+      <w:bookmarkStart w:id="23" w:name="_Toc242095258"/>
       <w:r>
         <w:t>4.4 Prompts</w:t>
       </w:r>
@@ -9225,12 +9209,11 @@
         <w:rPr>
           <w:noProof/>
         </w:rPr>
-        <w:lastRenderedPageBreak/>
         <w:drawing>
-          <wp:inline distT="0" distB="0" distL="0" distR="0" wp14:anchorId="7C0325C6" wp14:editId="1FCD253A">
+          <wp:inline distT="0" distB="0" distL="0" distR="0" wp14:anchorId="56A451DC" wp14:editId="78E54B0C">
             <wp:extent cx="6400800" cy="4000500"/>
             <wp:effectExtent l="0" t="0" r="0" b="0"/>
-            <wp:docPr id="1529483021" name="Picture 1529483021"/>
+            <wp:docPr id="1711704698" name="Picture 1711704698"/>
             <wp:cNvGraphicFramePr>
               <a:graphicFrameLocks xmlns:a="http://schemas.openxmlformats.org/drawingml/2006/main" noChangeAspect="1"/>
             </wp:cNvGraphicFramePr>
@@ -9361,9 +9344,8 @@
         <w:keepNext/>
         <w:pageBreakBefore/>
       </w:pPr>
-      <w:bookmarkStart w:id="24" w:name="_Toc241918832"/>
-      <w:r>
-        <w:lastRenderedPageBreak/>
+      <w:bookmarkStart w:id="24" w:name="_Toc242095259"/>
+      <w:r>
         <w:t>5. Architecture</w:t>
       </w:r>
       <w:bookmarkEnd w:id="24"/>
@@ -9373,7 +9355,7 @@
         <w:pStyle w:val="Heading2"/>
         <w:keepNext/>
       </w:pPr>
-      <w:bookmarkStart w:id="25" w:name="_Toc241918833"/>
+      <w:bookmarkStart w:id="25" w:name="_Toc242095260"/>
       <w:r>
         <w:t>5.1 Request flow</w:t>
       </w:r>
@@ -9496,7 +9478,7 @@
         <w:pStyle w:val="Heading2"/>
         <w:keepNext/>
       </w:pPr>
-      <w:bookmarkStart w:id="26" w:name="_Toc241918834"/>
+      <w:bookmarkStart w:id="26" w:name="_Toc242095261"/>
       <w:r>
         <w:t>5.2 Code layout</w:t>
       </w:r>
@@ -9662,7 +9644,7 @@
         <w:pStyle w:val="Heading2"/>
         <w:keepNext/>
       </w:pPr>
-      <w:bookmarkStart w:id="27" w:name="_Toc241918835"/>
+      <w:bookmarkStart w:id="27" w:name="_Toc242095262"/>
       <w:r>
         <w:t>5.3 Technology</w:t>
       </w:r>
@@ -10058,9 +10040,8 @@
         <w:keepNext/>
         <w:pageBreakBefore/>
       </w:pPr>
-      <w:bookmarkStart w:id="28" w:name="_Toc241918836"/>
-      <w:r>
-        <w:lastRenderedPageBreak/>
+      <w:bookmarkStart w:id="28" w:name="_Toc242095263"/>
+      <w:r>
         <w:t>6. Deployment</w:t>
       </w:r>
       <w:bookmarkEnd w:id="28"/>
@@ -10070,7 +10051,7 @@
         <w:pStyle w:val="Heading2"/>
         <w:keepNext/>
       </w:pPr>
-      <w:bookmarkStart w:id="29" w:name="_Toc241918837"/>
+      <w:bookmarkStart w:id="29" w:name="_Toc242095264"/>
       <w:r>
         <w:t>6.1 Production checklist</w:t>
       </w:r>
@@ -10198,7 +10179,7 @@
         <w:pStyle w:val="Heading2"/>
         <w:keepNext/>
       </w:pPr>
-      <w:bookmarkStart w:id="30" w:name="_Toc241918838"/>
+      <w:bookmarkStart w:id="30" w:name="_Toc242095265"/>
       <w:r>
         <w:t>6.2 Reverse proxy</w:t>
       </w:r>
@@ -10209,7 +10190,7 @@
         <w:spacing w:after="120"/>
       </w:pPr>
       <w:r>
-        <w:t xml:space="preserve">Amadeus Fare Rules &amp; Amenities AI Switch listens on plain HTTP (port 8000) and honours </w:t>
+        <w:t xml:space="preserve">Amadeus NDC Fare Rules &amp; Amenities AI Switch listens on plain HTTP (port 8000) and honours </w:t>
       </w:r>
       <w:r>
         <w:rPr>
@@ -10380,7 +10361,7 @@
         <w:pStyle w:val="Heading2"/>
         <w:keepNext/>
       </w:pPr>
-      <w:bookmarkStart w:id="31" w:name="_Toc241918839"/>
+      <w:bookmarkStart w:id="31" w:name="_Toc242095266"/>
       <w:r>
         <w:t>6.3 Scaling, persistence and upgrades</w:t>
       </w:r>
@@ -10521,10 +10502,9 @@
         <w:pStyle w:val="Heading2"/>
         <w:keepNext/>
       </w:pPr>
-      <w:bookmarkStart w:id="32" w:name="_Toc241918840"/>
-      <w:r>
-        <w:lastRenderedPageBreak/>
-        <w:t>6.4 What Amadeus Fare Rules &amp; Amenities AI Switch stores</w:t>
+      <w:bookmarkStart w:id="32" w:name="_Toc242095267"/>
+      <w:r>
+        <w:t>6.4 What Amadeus NDC Fare Rules &amp; Amenities AI Switch stores</w:t>
       </w:r>
       <w:bookmarkEnd w:id="32"/>
     </w:p>
@@ -11273,9 +11253,8 @@
         <w:keepNext/>
         <w:pageBreakBefore/>
       </w:pPr>
-      <w:bookmarkStart w:id="33" w:name="_Toc241918841"/>
-      <w:r>
-        <w:lastRenderedPageBreak/>
+      <w:bookmarkStart w:id="33" w:name="_Toc242095268"/>
+      <w:r>
         <w:t>7. Contributing, credits and license</w:t>
       </w:r>
       <w:bookmarkEnd w:id="33"/>
@@ -11361,7 +11340,7 @@
         <w:spacing w:after="120"/>
       </w:pPr>
       <w:r>
-        <w:t>Amadeus Fare Rules &amp; Amenities AI Switch is released under the MIT License. © 2026 TravelSwitch.</w:t>
+        <w:t>Amadeus NDC Fare Rules &amp; Amenities AI Switch is released under the MIT License. © 2026 TravelSwitch.</w:t>
       </w:r>
     </w:p>
     <w:p>
@@ -11567,7 +11546,7 @@
         <w:sz w:val="17"/>
         <w:szCs w:val="17"/>
       </w:rPr>
-      <w:t>Amadeus Fare Rules &amp; Amenities AI Switch · Product &amp; Technical Guide</w:t>
+      <w:t>Amadeus NDC Fare Rules &amp; Amenities AI Switch · Product &amp; Technical Guide</w:t>
     </w:r>
   </w:p>
 </w:hdr>
@@ -11576,10 +11555,10 @@
 <file path=word/numbering.xml><?xml version="1.0" encoding="utf-8"?>
 <w:numbering xmlns:wpc="http://schemas.microsoft.com/office/word/2010/wordprocessingCanvas" xmlns:cx="http://schemas.microsoft.com/office/drawing/2014/chartex" xmlns:cx1="http://schemas.microsoft.com/office/drawing/2015/9/8/chartex" xmlns:cx2="http://schemas.microsoft.com/office/drawing/2015/10/21/chartex" xmlns:cx3="http://schemas.microsoft.com/office/drawing/2016/5/9/chartex" xmlns:cx4="http://schemas.microsoft.com/office/drawing/2016/5/10/chartex" xmlns:cx5="http://schemas.microsoft.com/office/drawing/2016/5/11/chartex" xmlns:cx6="http://schemas.microsoft.com/office/drawing/2016/5/12/chartex" xmlns:cx7="http://schemas.microsoft.com/office/drawing/2016/5/13/chartex" xmlns:cx8="http://schemas.microsoft.com/office/drawing/2016/5/14/chartex" xmlns:mc="http://schemas.openxmlformats.org/markup-compatibility/2006" xmlns:aink="http://schemas.microsoft.com/office/drawing/2016/ink" xmlns:am3d="http://schemas.microsoft.com/office/drawing/2017/model3d" xmlns:o="urn:schemas-microsoft-com:office:office" xmlns:oel="http://schemas.microsoft.com/office/2019/extlst" xmlns:r="http://schemas.openxmlformats.org/officeDocument/2006/relationships" xmlns:m="http://schemas.openxmlformats.org/officeDocument/2006/math" xmlns:v="urn:schemas-microsoft-com:vml" xmlns:wp14="http://schemas.microsoft.com/office/word/2010/wordprocessingDrawing" xmlns:wp="http://schemas.openxmlformats.org/drawingml/2006/wordprocessingDrawing" xmlns:w10="urn:schemas-microsoft-com:office:word" xmlns:w="http://schemas.openxmlformats.org/wordprocessingml/2006/main" xmlns:w14="http://schemas.microsoft.com/office/word/2010/wordml" xmlns:w15="http://schemas.microsoft.com/office/word/2012/wordml" xmlns:w16cex="http://schemas.microsoft.com/office/word/2018/wordml/cex" xmlns:w16cid="http://schemas.microsoft.com/office/word/2016/wordml/cid" xmlns:w16="http://schemas.microsoft.com/office/word/2018/wordml" xmlns:w16du="http://schemas.microsoft.com/office/word/2023/wordml/word16du" xmlns:w16sdtdh="http://schemas.microsoft.com/office/word/2020/wordml/sdtdatahash" xmlns:w16sdtfl="http://schemas.microsoft.com/office/word/2024/wordml/sdtformatlock" xmlns:w16se="http://schemas.microsoft.com/office/word/2015/wordml/symex" xmlns:wpg="http://schemas.microsoft.com/office/word/2010/wordprocessingGroup" xmlns:wpi="http://schemas.microsoft.com/office/word/2010/wordprocessingInk" xmlns:wne="http://schemas.microsoft.com/office/word/2006/wordml" xmlns:wps="http://schemas.microsoft.com/office/word/2010/wordprocessingShape" mc:Ignorable="w14 w15 w16se w16cid w16 w16cex w16sdtdh w16sdtfl w16du wp14">
   <w:abstractNum w:abstractNumId="0" w15:restartNumberingAfterBreak="0">
-    <w:nsid w:val="2144787B"/>
+    <w:nsid w:val="0DCD29E8"/>
     <w:multiLevelType w:val="hybridMultilevel"/>
-    <w:tmpl w:val="C36A2AFA"/>
-    <w:lvl w:ilvl="0" w:tplc="175A5026">
+    <w:tmpl w:val="AD423E18"/>
+    <w:lvl w:ilvl="0" w:tplc="83DC3228">
       <w:start w:val="1"/>
       <w:numFmt w:val="bullet"/>
       <w:lvlText w:val="•"/>
@@ -11588,138 +11567,52 @@
         <w:ind w:left="540" w:hanging="270"/>
       </w:pPr>
     </w:lvl>
-    <w:lvl w:ilvl="1" w:tplc="2F1A4130">
+    <w:lvl w:ilvl="1" w:tplc="A6BE5832">
       <w:numFmt w:val="decimal"/>
       <w:lvlText w:val=""/>
       <w:lvlJc w:val="left"/>
     </w:lvl>
-    <w:lvl w:ilvl="2" w:tplc="241ED6A0">
+    <w:lvl w:ilvl="2" w:tplc="C936BED4">
       <w:numFmt w:val="decimal"/>
       <w:lvlText w:val=""/>
       <w:lvlJc w:val="left"/>
     </w:lvl>
-    <w:lvl w:ilvl="3" w:tplc="37BCAFBE">
+    <w:lvl w:ilvl="3" w:tplc="43B8663E">
       <w:numFmt w:val="decimal"/>
       <w:lvlText w:val=""/>
       <w:lvlJc w:val="left"/>
     </w:lvl>
-    <w:lvl w:ilvl="4" w:tplc="7B5048A2">
+    <w:lvl w:ilvl="4" w:tplc="E87C5CD6">
       <w:numFmt w:val="decimal"/>
       <w:lvlText w:val=""/>
       <w:lvlJc w:val="left"/>
     </w:lvl>
-    <w:lvl w:ilvl="5" w:tplc="D696C258">
+    <w:lvl w:ilvl="5" w:tplc="DE923EBE">
       <w:numFmt w:val="decimal"/>
       <w:lvlText w:val=""/>
       <w:lvlJc w:val="left"/>
     </w:lvl>
-    <w:lvl w:ilvl="6" w:tplc="21B476AA">
+    <w:lvl w:ilvl="6" w:tplc="6D0CE3E2">
       <w:numFmt w:val="decimal"/>
       <w:lvlText w:val=""/>
       <w:lvlJc w:val="left"/>
     </w:lvl>
-    <w:lvl w:ilvl="7" w:tplc="CFA6A244">
+    <w:lvl w:ilvl="7" w:tplc="EFA29CD2">
       <w:numFmt w:val="decimal"/>
       <w:lvlText w:val=""/>
       <w:lvlJc w:val="left"/>
     </w:lvl>
-    <w:lvl w:ilvl="8" w:tplc="7AE65C80">
+    <w:lvl w:ilvl="8" w:tplc="A45A9D96">
       <w:numFmt w:val="decimal"/>
       <w:lvlText w:val=""/>
       <w:lvlJc w:val="left"/>
     </w:lvl>
   </w:abstractNum>
   <w:abstractNum w:abstractNumId="1" w15:restartNumberingAfterBreak="0">
-    <w:nsid w:val="2BCA0F1D"/>
+    <w:nsid w:val="32C57C8C"/>
     <w:multiLevelType w:val="hybridMultilevel"/>
-    <w:tmpl w:val="D668D212"/>
-    <w:lvl w:ilvl="0" w:tplc="AFA494A8">
-      <w:start w:val="1"/>
-      <w:numFmt w:val="bullet"/>
-      <w:lvlText w:val="●"/>
-      <w:lvlJc w:val="left"/>
-      <w:pPr>
-        <w:ind w:left="720" w:hanging="360"/>
-      </w:pPr>
-    </w:lvl>
-    <w:lvl w:ilvl="1" w:tplc="94B8DAE6">
-      <w:start w:val="1"/>
-      <w:numFmt w:val="bullet"/>
-      <w:lvlText w:val="○"/>
-      <w:lvlJc w:val="left"/>
-      <w:pPr>
-        <w:ind w:left="1440" w:hanging="360"/>
-      </w:pPr>
-    </w:lvl>
-    <w:lvl w:ilvl="2" w:tplc="31F63914">
-      <w:start w:val="1"/>
-      <w:numFmt w:val="bullet"/>
-      <w:lvlText w:val="■"/>
-      <w:lvlJc w:val="left"/>
-      <w:pPr>
-        <w:ind w:left="2160" w:hanging="360"/>
-      </w:pPr>
-    </w:lvl>
-    <w:lvl w:ilvl="3" w:tplc="249AAFAA">
-      <w:start w:val="1"/>
-      <w:numFmt w:val="bullet"/>
-      <w:lvlText w:val="●"/>
-      <w:lvlJc w:val="left"/>
-      <w:pPr>
-        <w:ind w:left="2880" w:hanging="360"/>
-      </w:pPr>
-    </w:lvl>
-    <w:lvl w:ilvl="4" w:tplc="82BC0BDA">
-      <w:start w:val="1"/>
-      <w:numFmt w:val="bullet"/>
-      <w:lvlText w:val="○"/>
-      <w:lvlJc w:val="left"/>
-      <w:pPr>
-        <w:ind w:left="3600" w:hanging="360"/>
-      </w:pPr>
-    </w:lvl>
-    <w:lvl w:ilvl="5" w:tplc="194A9DF0">
-      <w:start w:val="1"/>
-      <w:numFmt w:val="bullet"/>
-      <w:lvlText w:val="■"/>
-      <w:lvlJc w:val="left"/>
-      <w:pPr>
-        <w:ind w:left="4320" w:hanging="360"/>
-      </w:pPr>
-    </w:lvl>
-    <w:lvl w:ilvl="6" w:tplc="966E9C62">
-      <w:start w:val="1"/>
-      <w:numFmt w:val="bullet"/>
-      <w:lvlText w:val="●"/>
-      <w:lvlJc w:val="left"/>
-      <w:pPr>
-        <w:ind w:left="5040" w:hanging="360"/>
-      </w:pPr>
-    </w:lvl>
-    <w:lvl w:ilvl="7" w:tplc="DACAFD8A">
-      <w:start w:val="1"/>
-      <w:numFmt w:val="bullet"/>
-      <w:lvlText w:val="●"/>
-      <w:lvlJc w:val="left"/>
-      <w:pPr>
-        <w:ind w:left="5760" w:hanging="360"/>
-      </w:pPr>
-    </w:lvl>
-    <w:lvl w:ilvl="8" w:tplc="538A5D28">
-      <w:start w:val="1"/>
-      <w:numFmt w:val="bullet"/>
-      <w:lvlText w:val="●"/>
-      <w:lvlJc w:val="left"/>
-      <w:pPr>
-        <w:ind w:left="6480" w:hanging="360"/>
-      </w:pPr>
-    </w:lvl>
-  </w:abstractNum>
-  <w:abstractNum w:abstractNumId="2" w15:restartNumberingAfterBreak="0">
-    <w:nsid w:val="6B957867"/>
-    <w:multiLevelType w:val="hybridMultilevel"/>
-    <w:tmpl w:val="ADE81410"/>
-    <w:lvl w:ilvl="0" w:tplc="1478958E">
+    <w:tmpl w:val="961E8692"/>
+    <w:lvl w:ilvl="0" w:tplc="FCA88048">
       <w:start w:val="1"/>
       <w:numFmt w:val="bullet"/>
       <w:lvlText w:val="☐"/>
@@ -11728,52 +11621,138 @@
         <w:ind w:left="540" w:hanging="320"/>
       </w:pPr>
     </w:lvl>
-    <w:lvl w:ilvl="1" w:tplc="FEA0CA48">
+    <w:lvl w:ilvl="1" w:tplc="AA703F28">
       <w:numFmt w:val="decimal"/>
       <w:lvlText w:val=""/>
       <w:lvlJc w:val="left"/>
     </w:lvl>
-    <w:lvl w:ilvl="2" w:tplc="CBB2023E">
+    <w:lvl w:ilvl="2" w:tplc="5A7CA440">
       <w:numFmt w:val="decimal"/>
       <w:lvlText w:val=""/>
       <w:lvlJc w:val="left"/>
     </w:lvl>
-    <w:lvl w:ilvl="3" w:tplc="806AD9F2">
+    <w:lvl w:ilvl="3" w:tplc="A5B8342C">
       <w:numFmt w:val="decimal"/>
       <w:lvlText w:val=""/>
       <w:lvlJc w:val="left"/>
     </w:lvl>
-    <w:lvl w:ilvl="4" w:tplc="A1A00766">
+    <w:lvl w:ilvl="4" w:tplc="F94A4394">
       <w:numFmt w:val="decimal"/>
       <w:lvlText w:val=""/>
       <w:lvlJc w:val="left"/>
     </w:lvl>
-    <w:lvl w:ilvl="5" w:tplc="465EF92E">
+    <w:lvl w:ilvl="5" w:tplc="05C2529C">
       <w:numFmt w:val="decimal"/>
       <w:lvlText w:val=""/>
       <w:lvlJc w:val="left"/>
     </w:lvl>
-    <w:lvl w:ilvl="6" w:tplc="08BC83F6">
+    <w:lvl w:ilvl="6" w:tplc="826E4942">
       <w:numFmt w:val="decimal"/>
       <w:lvlText w:val=""/>
       <w:lvlJc w:val="left"/>
     </w:lvl>
-    <w:lvl w:ilvl="7" w:tplc="E30862F4">
+    <w:lvl w:ilvl="7" w:tplc="00620E0A">
       <w:numFmt w:val="decimal"/>
       <w:lvlText w:val=""/>
       <w:lvlJc w:val="left"/>
     </w:lvl>
-    <w:lvl w:ilvl="8" w:tplc="8DB28A90">
+    <w:lvl w:ilvl="8" w:tplc="F698D4E6">
       <w:numFmt w:val="decimal"/>
       <w:lvlText w:val=""/>
       <w:lvlJc w:val="left"/>
     </w:lvl>
   </w:abstractNum>
+  <w:abstractNum w:abstractNumId="2" w15:restartNumberingAfterBreak="0">
+    <w:nsid w:val="42561ABC"/>
+    <w:multiLevelType w:val="hybridMultilevel"/>
+    <w:tmpl w:val="B82CFDE8"/>
+    <w:lvl w:ilvl="0" w:tplc="61AEB4FA">
+      <w:start w:val="1"/>
+      <w:numFmt w:val="bullet"/>
+      <w:lvlText w:val="●"/>
+      <w:lvlJc w:val="left"/>
+      <w:pPr>
+        <w:ind w:left="720" w:hanging="360"/>
+      </w:pPr>
+    </w:lvl>
+    <w:lvl w:ilvl="1" w:tplc="83D29E3A">
+      <w:start w:val="1"/>
+      <w:numFmt w:val="bullet"/>
+      <w:lvlText w:val="○"/>
+      <w:lvlJc w:val="left"/>
+      <w:pPr>
+        <w:ind w:left="1440" w:hanging="360"/>
+      </w:pPr>
+    </w:lvl>
+    <w:lvl w:ilvl="2" w:tplc="C242DBE4">
+      <w:start w:val="1"/>
+      <w:numFmt w:val="bullet"/>
+      <w:lvlText w:val="■"/>
+      <w:lvlJc w:val="left"/>
+      <w:pPr>
+        <w:ind w:left="2160" w:hanging="360"/>
+      </w:pPr>
+    </w:lvl>
+    <w:lvl w:ilvl="3" w:tplc="59D6E076">
+      <w:start w:val="1"/>
+      <w:numFmt w:val="bullet"/>
+      <w:lvlText w:val="●"/>
+      <w:lvlJc w:val="left"/>
+      <w:pPr>
+        <w:ind w:left="2880" w:hanging="360"/>
+      </w:pPr>
+    </w:lvl>
+    <w:lvl w:ilvl="4" w:tplc="9B429D6A">
+      <w:start w:val="1"/>
+      <w:numFmt w:val="bullet"/>
+      <w:lvlText w:val="○"/>
+      <w:lvlJc w:val="left"/>
+      <w:pPr>
+        <w:ind w:left="3600" w:hanging="360"/>
+      </w:pPr>
+    </w:lvl>
+    <w:lvl w:ilvl="5" w:tplc="69F07BF4">
+      <w:start w:val="1"/>
+      <w:numFmt w:val="bullet"/>
+      <w:lvlText w:val="■"/>
+      <w:lvlJc w:val="left"/>
+      <w:pPr>
+        <w:ind w:left="4320" w:hanging="360"/>
+      </w:pPr>
+    </w:lvl>
+    <w:lvl w:ilvl="6" w:tplc="C5361F52">
+      <w:start w:val="1"/>
+      <w:numFmt w:val="bullet"/>
+      <w:lvlText w:val="●"/>
+      <w:lvlJc w:val="left"/>
+      <w:pPr>
+        <w:ind w:left="5040" w:hanging="360"/>
+      </w:pPr>
+    </w:lvl>
+    <w:lvl w:ilvl="7" w:tplc="F95E3E74">
+      <w:start w:val="1"/>
+      <w:numFmt w:val="bullet"/>
+      <w:lvlText w:val="●"/>
+      <w:lvlJc w:val="left"/>
+      <w:pPr>
+        <w:ind w:left="5760" w:hanging="360"/>
+      </w:pPr>
+    </w:lvl>
+    <w:lvl w:ilvl="8" w:tplc="48E4DD86">
+      <w:start w:val="1"/>
+      <w:numFmt w:val="bullet"/>
+      <w:lvlText w:val="●"/>
+      <w:lvlJc w:val="left"/>
+      <w:pPr>
+        <w:ind w:left="6480" w:hanging="360"/>
+      </w:pPr>
+    </w:lvl>
+  </w:abstractNum>
   <w:abstractNum w:abstractNumId="3" w15:restartNumberingAfterBreak="0">
-    <w:nsid w:val="7E874B40"/>
+    <w:nsid w:val="6EEE6B95"/>
     <w:multiLevelType w:val="hybridMultilevel"/>
-    <w:tmpl w:val="2C947B64"/>
-    <w:lvl w:ilvl="0" w:tplc="31862B50">
+    <w:tmpl w:val="F4EA564E"/>
+    <w:lvl w:ilvl="0" w:tplc="74961BD0">
       <w:start w:val="1"/>
       <w:numFmt w:val="decimal"/>
       <w:lvlText w:val="%1."/>
@@ -11782,67 +11761,67 @@
         <w:ind w:left="540" w:hanging="360"/>
       </w:pPr>
     </w:lvl>
-    <w:lvl w:ilvl="1" w:tplc="FA02CFD0">
+    <w:lvl w:ilvl="1" w:tplc="7F4639F6">
       <w:numFmt w:val="decimal"/>
       <w:lvlText w:val=""/>
       <w:lvlJc w:val="left"/>
     </w:lvl>
-    <w:lvl w:ilvl="2" w:tplc="F6189A66">
+    <w:lvl w:ilvl="2" w:tplc="218E8D34">
       <w:numFmt w:val="decimal"/>
       <w:lvlText w:val=""/>
       <w:lvlJc w:val="left"/>
     </w:lvl>
-    <w:lvl w:ilvl="3" w:tplc="AB78CCB0">
+    <w:lvl w:ilvl="3" w:tplc="93E08364">
       <w:numFmt w:val="decimal"/>
       <w:lvlText w:val=""/>
       <w:lvlJc w:val="left"/>
     </w:lvl>
-    <w:lvl w:ilvl="4" w:tplc="FE547282">
+    <w:lvl w:ilvl="4" w:tplc="330804A8">
       <w:numFmt w:val="decimal"/>
       <w:lvlText w:val=""/>
       <w:lvlJc w:val="left"/>
     </w:lvl>
-    <w:lvl w:ilvl="5" w:tplc="5D6A124C">
+    <w:lvl w:ilvl="5" w:tplc="19D8F106">
       <w:numFmt w:val="decimal"/>
       <w:lvlText w:val=""/>
       <w:lvlJc w:val="left"/>
     </w:lvl>
-    <w:lvl w:ilvl="6" w:tplc="62DC0E2E">
+    <w:lvl w:ilvl="6" w:tplc="1AEE7E20">
       <w:numFmt w:val="decimal"/>
       <w:lvlText w:val=""/>
       <w:lvlJc w:val="left"/>
     </w:lvl>
-    <w:lvl w:ilvl="7" w:tplc="35C2D194">
+    <w:lvl w:ilvl="7" w:tplc="2EEA2E56">
       <w:numFmt w:val="decimal"/>
       <w:lvlText w:val=""/>
       <w:lvlJc w:val="left"/>
     </w:lvl>
-    <w:lvl w:ilvl="8" w:tplc="BF3015F8">
+    <w:lvl w:ilvl="8" w:tplc="03D8B9C8">
       <w:numFmt w:val="decimal"/>
       <w:lvlText w:val=""/>
       <w:lvlJc w:val="left"/>
     </w:lvl>
   </w:abstractNum>
-  <w:num w:numId="1" w16cid:durableId="1612204792">
-    <w:abstractNumId w:val="1"/>
+  <w:num w:numId="1" w16cid:durableId="1097364345">
+    <w:abstractNumId w:val="2"/>
     <w:lvlOverride w:ilvl="0">
       <w:startOverride w:val="1"/>
     </w:lvlOverride>
   </w:num>
-  <w:num w:numId="2" w16cid:durableId="2047562629">
+  <w:num w:numId="2" w16cid:durableId="1448621995">
     <w:abstractNumId w:val="0"/>
     <w:lvlOverride w:ilvl="0">
       <w:startOverride w:val="1"/>
     </w:lvlOverride>
   </w:num>
-  <w:num w:numId="3" w16cid:durableId="257325095">
+  <w:num w:numId="3" w16cid:durableId="558632405">
     <w:abstractNumId w:val="3"/>
     <w:lvlOverride w:ilvl="0">
       <w:startOverride w:val="1"/>
     </w:lvlOverride>
   </w:num>
-  <w:num w:numId="4" w16cid:durableId="1972124301">
-    <w:abstractNumId w:val="2"/>
+  <w:num w:numId="4" w16cid:durableId="2101758015">
+    <w:abstractNumId w:val="1"/>
     <w:lvlOverride w:ilvl="0">
       <w:startOverride w:val="1"/>
     </w:lvlOverride>
@@ -12462,7 +12441,7 @@
     <w:autoRedefine/>
     <w:uiPriority w:val="39"/>
     <w:unhideWhenUsed/>
-    <w:rsid w:val="004073B4"/>
+    <w:rsid w:val="00955E19"/>
     <w:pPr>
       <w:spacing w:after="100"/>
     </w:pPr>
@@ -12474,7 +12453,7 @@
     <w:autoRedefine/>
     <w:uiPriority w:val="39"/>
     <w:unhideWhenUsed/>
-    <w:rsid w:val="004073B4"/>
+    <w:rsid w:val="00955E19"/>
     <w:pPr>
       <w:spacing w:after="100"/>
       <w:ind w:left="210"/>

</xml_diff>

<commit_message>
Refresh screenshots and guides for the latest UI
</commit_message>
<xml_diff>
--- a/docs/Amadeus-Fare-Rules-Amenities-AI-Switch-Guide.docx
+++ b/docs/Amadeus-Fare-Rules-Amenities-AI-Switch-Guide.docx
@@ -17,7 +17,7 @@
           <w:noProof/>
         </w:rPr>
         <w:drawing>
-          <wp:inline distT="0" distB="0" distL="0" distR="0" wp14:anchorId="25347478" wp14:editId="6864EAE5">
+          <wp:inline distT="0" distB="0" distL="0" distR="0" wp14:anchorId="0D01872D" wp14:editId="0EAB8392">
             <wp:extent cx="1905000" cy="266700"/>
             <wp:effectExtent l="0" t="0" r="0" b="0"/>
             <wp:docPr id="1" name="Picture 1"/>
@@ -181,7 +181,7 @@
     <w:sdt>
       <w:sdtPr>
         <w:alias w:val="Contents"/>
-        <w:id w:val="1738275837"/>
+        <w:id w:val="-1641959820"/>
       </w:sdtPr>
       <w:sdtEndPr/>
       <w:sdtContent>
@@ -192,13 +192,7 @@
               <w:tab w:val="right" w:leader="dot" w:pos="10070"/>
             </w:tabs>
             <w:rPr>
-              <w:rFonts w:asciiTheme="minorHAnsi" w:eastAsiaTheme="minorEastAsia" w:hAnsiTheme="minorHAnsi" w:cstheme="minorBidi"/>
               <w:noProof/>
-              <w:color w:val="auto"/>
-              <w:kern w:val="2"/>
-              <w:sz w:val="24"/>
-              <w:szCs w:val="24"/>
-              <w14:ligatures w14:val="standardContextual"/>
             </w:rPr>
           </w:pPr>
           <w:r>
@@ -210,7 +204,7 @@
           <w:r>
             <w:fldChar w:fldCharType="separate"/>
           </w:r>
-          <w:hyperlink w:anchor="_Toc242095235" w:history="1">
+          <w:hyperlink w:anchor="_Toc242098688" w:history="1">
             <w:r>
               <w:rPr>
                 <w:rStyle w:val="Hyperlink"/>
@@ -234,7 +228,7 @@
               <w:rPr>
                 <w:noProof/>
               </w:rPr>
-              <w:instrText xml:space="preserve"> PAGEREF _Toc242095235 \h </w:instrText>
+              <w:instrText xml:space="preserve"> PAGEREF _Toc242098688 \h </w:instrText>
             </w:r>
             <w:r>
               <w:rPr>
@@ -268,16 +262,10 @@
               <w:tab w:val="right" w:leader="dot" w:pos="10070"/>
             </w:tabs>
             <w:rPr>
-              <w:rFonts w:asciiTheme="minorHAnsi" w:eastAsiaTheme="minorEastAsia" w:hAnsiTheme="minorHAnsi" w:cstheme="minorBidi"/>
               <w:noProof/>
-              <w:color w:val="auto"/>
-              <w:kern w:val="2"/>
-              <w:sz w:val="24"/>
-              <w:szCs w:val="24"/>
-              <w14:ligatures w14:val="standardContextual"/>
             </w:rPr>
           </w:pPr>
-          <w:hyperlink w:anchor="_Toc242095236" w:history="1">
+          <w:hyperlink w:anchor="_Toc242098689" w:history="1">
             <w:r>
               <w:rPr>
                 <w:rStyle w:val="Hyperlink"/>
@@ -301,7 +289,7 @@
               <w:rPr>
                 <w:noProof/>
               </w:rPr>
-              <w:instrText xml:space="preserve"> PAGEREF _Toc242095236 \h </w:instrText>
+              <w:instrText xml:space="preserve"> PAGEREF _Toc242098689 \h </w:instrText>
             </w:r>
             <w:r>
               <w:rPr>
@@ -335,16 +323,10 @@
               <w:tab w:val="right" w:leader="dot" w:pos="10070"/>
             </w:tabs>
             <w:rPr>
-              <w:rFonts w:asciiTheme="minorHAnsi" w:eastAsiaTheme="minorEastAsia" w:hAnsiTheme="minorHAnsi" w:cstheme="minorBidi"/>
               <w:noProof/>
-              <w:color w:val="auto"/>
-              <w:kern w:val="2"/>
-              <w:sz w:val="24"/>
-              <w:szCs w:val="24"/>
-              <w14:ligatures w14:val="standardContextual"/>
             </w:rPr>
           </w:pPr>
-          <w:hyperlink w:anchor="_Toc242095237" w:history="1">
+          <w:hyperlink w:anchor="_Toc242098690" w:history="1">
             <w:r>
               <w:rPr>
                 <w:rStyle w:val="Hyperlink"/>
@@ -368,7 +350,7 @@
               <w:rPr>
                 <w:noProof/>
               </w:rPr>
-              <w:instrText xml:space="preserve"> PAGEREF _Toc242095237 \h </w:instrText>
+              <w:instrText xml:space="preserve"> PAGEREF _Toc242098690 \h </w:instrText>
             </w:r>
             <w:r>
               <w:rPr>
@@ -402,16 +384,10 @@
               <w:tab w:val="right" w:leader="dot" w:pos="10070"/>
             </w:tabs>
             <w:rPr>
-              <w:rFonts w:asciiTheme="minorHAnsi" w:eastAsiaTheme="minorEastAsia" w:hAnsiTheme="minorHAnsi" w:cstheme="minorBidi"/>
               <w:noProof/>
-              <w:color w:val="auto"/>
-              <w:kern w:val="2"/>
-              <w:sz w:val="24"/>
-              <w:szCs w:val="24"/>
-              <w14:ligatures w14:val="standardContextual"/>
             </w:rPr>
           </w:pPr>
-          <w:hyperlink w:anchor="_Toc242095238" w:history="1">
+          <w:hyperlink w:anchor="_Toc242098691" w:history="1">
             <w:r>
               <w:rPr>
                 <w:rStyle w:val="Hyperlink"/>
@@ -435,7 +411,7 @@
               <w:rPr>
                 <w:noProof/>
               </w:rPr>
-              <w:instrText xml:space="preserve"> PAGEREF _Toc242095238 \h </w:instrText>
+              <w:instrText xml:space="preserve"> PAGEREF _Toc242098691 \h </w:instrText>
             </w:r>
             <w:r>
               <w:rPr>
@@ -469,16 +445,10 @@
               <w:tab w:val="right" w:leader="dot" w:pos="10070"/>
             </w:tabs>
             <w:rPr>
-              <w:rFonts w:asciiTheme="minorHAnsi" w:eastAsiaTheme="minorEastAsia" w:hAnsiTheme="minorHAnsi" w:cstheme="minorBidi"/>
               <w:noProof/>
-              <w:color w:val="auto"/>
-              <w:kern w:val="2"/>
-              <w:sz w:val="24"/>
-              <w:szCs w:val="24"/>
-              <w14:ligatures w14:val="standardContextual"/>
             </w:rPr>
           </w:pPr>
-          <w:hyperlink w:anchor="_Toc242095239" w:history="1">
+          <w:hyperlink w:anchor="_Toc242098692" w:history="1">
             <w:r>
               <w:rPr>
                 <w:rStyle w:val="Hyperlink"/>
@@ -502,7 +472,7 @@
               <w:rPr>
                 <w:noProof/>
               </w:rPr>
-              <w:instrText xml:space="preserve"> PAGEREF _Toc242095239 \h </w:instrText>
+              <w:instrText xml:space="preserve"> PAGEREF _Toc242098692 \h </w:instrText>
             </w:r>
             <w:r>
               <w:rPr>
@@ -536,16 +506,10 @@
               <w:tab w:val="right" w:leader="dot" w:pos="10070"/>
             </w:tabs>
             <w:rPr>
-              <w:rFonts w:asciiTheme="minorHAnsi" w:eastAsiaTheme="minorEastAsia" w:hAnsiTheme="minorHAnsi" w:cstheme="minorBidi"/>
               <w:noProof/>
-              <w:color w:val="auto"/>
-              <w:kern w:val="2"/>
-              <w:sz w:val="24"/>
-              <w:szCs w:val="24"/>
-              <w14:ligatures w14:val="standardContextual"/>
             </w:rPr>
           </w:pPr>
-          <w:hyperlink w:anchor="_Toc242095240" w:history="1">
+          <w:hyperlink w:anchor="_Toc242098693" w:history="1">
             <w:r>
               <w:rPr>
                 <w:rStyle w:val="Hyperlink"/>
@@ -569,7 +533,7 @@
               <w:rPr>
                 <w:noProof/>
               </w:rPr>
-              <w:instrText xml:space="preserve"> PAGEREF _Toc242095240 \h </w:instrText>
+              <w:instrText xml:space="preserve"> PAGEREF _Toc242098693 \h </w:instrText>
             </w:r>
             <w:r>
               <w:rPr>
@@ -603,16 +567,10 @@
               <w:tab w:val="right" w:leader="dot" w:pos="10070"/>
             </w:tabs>
             <w:rPr>
-              <w:rFonts w:asciiTheme="minorHAnsi" w:eastAsiaTheme="minorEastAsia" w:hAnsiTheme="minorHAnsi" w:cstheme="minorBidi"/>
               <w:noProof/>
-              <w:color w:val="auto"/>
-              <w:kern w:val="2"/>
-              <w:sz w:val="24"/>
-              <w:szCs w:val="24"/>
-              <w14:ligatures w14:val="standardContextual"/>
             </w:rPr>
           </w:pPr>
-          <w:hyperlink w:anchor="_Toc242095241" w:history="1">
+          <w:hyperlink w:anchor="_Toc242098694" w:history="1">
             <w:r>
               <w:rPr>
                 <w:rStyle w:val="Hyperlink"/>
@@ -636,7 +594,7 @@
               <w:rPr>
                 <w:noProof/>
               </w:rPr>
-              <w:instrText xml:space="preserve"> PAGEREF _Toc242095241 \h </w:instrText>
+              <w:instrText xml:space="preserve"> PAGEREF _Toc242098694 \h </w:instrText>
             </w:r>
             <w:r>
               <w:rPr>
@@ -670,16 +628,10 @@
               <w:tab w:val="right" w:leader="dot" w:pos="10070"/>
             </w:tabs>
             <w:rPr>
-              <w:rFonts w:asciiTheme="minorHAnsi" w:eastAsiaTheme="minorEastAsia" w:hAnsiTheme="minorHAnsi" w:cstheme="minorBidi"/>
               <w:noProof/>
-              <w:color w:val="auto"/>
-              <w:kern w:val="2"/>
-              <w:sz w:val="24"/>
-              <w:szCs w:val="24"/>
-              <w14:ligatures w14:val="standardContextual"/>
             </w:rPr>
           </w:pPr>
-          <w:hyperlink w:anchor="_Toc242095242" w:history="1">
+          <w:hyperlink w:anchor="_Toc242098695" w:history="1">
             <w:r>
               <w:rPr>
                 <w:rStyle w:val="Hyperlink"/>
@@ -703,7 +655,7 @@
               <w:rPr>
                 <w:noProof/>
               </w:rPr>
-              <w:instrText xml:space="preserve"> PAGEREF _Toc242095242 \h </w:instrText>
+              <w:instrText xml:space="preserve"> PAGEREF _Toc242098695 \h </w:instrText>
             </w:r>
             <w:r>
               <w:rPr>
@@ -737,16 +689,10 @@
               <w:tab w:val="right" w:leader="dot" w:pos="10070"/>
             </w:tabs>
             <w:rPr>
-              <w:rFonts w:asciiTheme="minorHAnsi" w:eastAsiaTheme="minorEastAsia" w:hAnsiTheme="minorHAnsi" w:cstheme="minorBidi"/>
               <w:noProof/>
-              <w:color w:val="auto"/>
-              <w:kern w:val="2"/>
-              <w:sz w:val="24"/>
-              <w:szCs w:val="24"/>
-              <w14:ligatures w14:val="standardContextual"/>
             </w:rPr>
           </w:pPr>
-          <w:hyperlink w:anchor="_Toc242095243" w:history="1">
+          <w:hyperlink w:anchor="_Toc242098696" w:history="1">
             <w:r>
               <w:rPr>
                 <w:rStyle w:val="Hyperlink"/>
@@ -770,7 +716,7 @@
               <w:rPr>
                 <w:noProof/>
               </w:rPr>
-              <w:instrText xml:space="preserve"> PAGEREF _Toc242095243 \h </w:instrText>
+              <w:instrText xml:space="preserve"> PAGEREF _Toc242098696 \h </w:instrText>
             </w:r>
             <w:r>
               <w:rPr>
@@ -804,16 +750,10 @@
               <w:tab w:val="right" w:leader="dot" w:pos="10070"/>
             </w:tabs>
             <w:rPr>
-              <w:rFonts w:asciiTheme="minorHAnsi" w:eastAsiaTheme="minorEastAsia" w:hAnsiTheme="minorHAnsi" w:cstheme="minorBidi"/>
               <w:noProof/>
-              <w:color w:val="auto"/>
-              <w:kern w:val="2"/>
-              <w:sz w:val="24"/>
-              <w:szCs w:val="24"/>
-              <w14:ligatures w14:val="standardContextual"/>
             </w:rPr>
           </w:pPr>
-          <w:hyperlink w:anchor="_Toc242095244" w:history="1">
+          <w:hyperlink w:anchor="_Toc242098697" w:history="1">
             <w:r>
               <w:rPr>
                 <w:rStyle w:val="Hyperlink"/>
@@ -837,7 +777,7 @@
               <w:rPr>
                 <w:noProof/>
               </w:rPr>
-              <w:instrText xml:space="preserve"> PAGEREF _Toc242095244 \h </w:instrText>
+              <w:instrText xml:space="preserve"> PAGEREF _Toc242098697 \h </w:instrText>
             </w:r>
             <w:r>
               <w:rPr>
@@ -871,16 +811,10 @@
               <w:tab w:val="right" w:leader="dot" w:pos="10070"/>
             </w:tabs>
             <w:rPr>
-              <w:rFonts w:asciiTheme="minorHAnsi" w:eastAsiaTheme="minorEastAsia" w:hAnsiTheme="minorHAnsi" w:cstheme="minorBidi"/>
               <w:noProof/>
-              <w:color w:val="auto"/>
-              <w:kern w:val="2"/>
-              <w:sz w:val="24"/>
-              <w:szCs w:val="24"/>
-              <w14:ligatures w14:val="standardContextual"/>
             </w:rPr>
           </w:pPr>
-          <w:hyperlink w:anchor="_Toc242095245" w:history="1">
+          <w:hyperlink w:anchor="_Toc242098698" w:history="1">
             <w:r>
               <w:rPr>
                 <w:rStyle w:val="Hyperlink"/>
@@ -904,7 +838,7 @@
               <w:rPr>
                 <w:noProof/>
               </w:rPr>
-              <w:instrText xml:space="preserve"> PAGEREF _Toc242095245 \h </w:instrText>
+              <w:instrText xml:space="preserve"> PAGEREF _Toc242098698 \h </w:instrText>
             </w:r>
             <w:r>
               <w:rPr>
@@ -938,16 +872,10 @@
               <w:tab w:val="right" w:leader="dot" w:pos="10070"/>
             </w:tabs>
             <w:rPr>
-              <w:rFonts w:asciiTheme="minorHAnsi" w:eastAsiaTheme="minorEastAsia" w:hAnsiTheme="minorHAnsi" w:cstheme="minorBidi"/>
               <w:noProof/>
-              <w:color w:val="auto"/>
-              <w:kern w:val="2"/>
-              <w:sz w:val="24"/>
-              <w:szCs w:val="24"/>
-              <w14:ligatures w14:val="standardContextual"/>
             </w:rPr>
           </w:pPr>
-          <w:hyperlink w:anchor="_Toc242095246" w:history="1">
+          <w:hyperlink w:anchor="_Toc242098699" w:history="1">
             <w:r>
               <w:rPr>
                 <w:rStyle w:val="Hyperlink"/>
@@ -971,7 +899,7 @@
               <w:rPr>
                 <w:noProof/>
               </w:rPr>
-              <w:instrText xml:space="preserve"> PAGEREF _Toc242095246 \h </w:instrText>
+              <w:instrText xml:space="preserve"> PAGEREF _Toc242098699 \h </w:instrText>
             </w:r>
             <w:r>
               <w:rPr>
@@ -1005,16 +933,10 @@
               <w:tab w:val="right" w:leader="dot" w:pos="10070"/>
             </w:tabs>
             <w:rPr>
-              <w:rFonts w:asciiTheme="minorHAnsi" w:eastAsiaTheme="minorEastAsia" w:hAnsiTheme="minorHAnsi" w:cstheme="minorBidi"/>
               <w:noProof/>
-              <w:color w:val="auto"/>
-              <w:kern w:val="2"/>
-              <w:sz w:val="24"/>
-              <w:szCs w:val="24"/>
-              <w14:ligatures w14:val="standardContextual"/>
             </w:rPr>
           </w:pPr>
-          <w:hyperlink w:anchor="_Toc242095247" w:history="1">
+          <w:hyperlink w:anchor="_Toc242098700" w:history="1">
             <w:r>
               <w:rPr>
                 <w:rStyle w:val="Hyperlink"/>
@@ -1038,7 +960,7 @@
               <w:rPr>
                 <w:noProof/>
               </w:rPr>
-              <w:instrText xml:space="preserve"> PAGEREF _Toc242095247 \h </w:instrText>
+              <w:instrText xml:space="preserve"> PAGEREF _Toc242098700 \h </w:instrText>
             </w:r>
             <w:r>
               <w:rPr>
@@ -1072,16 +994,10 @@
               <w:tab w:val="right" w:leader="dot" w:pos="10070"/>
             </w:tabs>
             <w:rPr>
-              <w:rFonts w:asciiTheme="minorHAnsi" w:eastAsiaTheme="minorEastAsia" w:hAnsiTheme="minorHAnsi" w:cstheme="minorBidi"/>
               <w:noProof/>
-              <w:color w:val="auto"/>
-              <w:kern w:val="2"/>
-              <w:sz w:val="24"/>
-              <w:szCs w:val="24"/>
-              <w14:ligatures w14:val="standardContextual"/>
             </w:rPr>
           </w:pPr>
-          <w:hyperlink w:anchor="_Toc242095248" w:history="1">
+          <w:hyperlink w:anchor="_Toc242098701" w:history="1">
             <w:r>
               <w:rPr>
                 <w:rStyle w:val="Hyperlink"/>
@@ -1105,7 +1021,7 @@
               <w:rPr>
                 <w:noProof/>
               </w:rPr>
-              <w:instrText xml:space="preserve"> PAGEREF _Toc242095248 \h </w:instrText>
+              <w:instrText xml:space="preserve"> PAGEREF _Toc242098701 \h </w:instrText>
             </w:r>
             <w:r>
               <w:rPr>
@@ -1139,16 +1055,10 @@
               <w:tab w:val="right" w:leader="dot" w:pos="10070"/>
             </w:tabs>
             <w:rPr>
-              <w:rFonts w:asciiTheme="minorHAnsi" w:eastAsiaTheme="minorEastAsia" w:hAnsiTheme="minorHAnsi" w:cstheme="minorBidi"/>
               <w:noProof/>
-              <w:color w:val="auto"/>
-              <w:kern w:val="2"/>
-              <w:sz w:val="24"/>
-              <w:szCs w:val="24"/>
-              <w14:ligatures w14:val="standardContextual"/>
             </w:rPr>
           </w:pPr>
-          <w:hyperlink w:anchor="_Toc242095249" w:history="1">
+          <w:hyperlink w:anchor="_Toc242098702" w:history="1">
             <w:r>
               <w:rPr>
                 <w:rStyle w:val="Hyperlink"/>
@@ -1172,7 +1082,7 @@
               <w:rPr>
                 <w:noProof/>
               </w:rPr>
-              <w:instrText xml:space="preserve"> PAGEREF _Toc242095249 \h </w:instrText>
+              <w:instrText xml:space="preserve"> PAGEREF _Toc242098702 \h </w:instrText>
             </w:r>
             <w:r>
               <w:rPr>
@@ -1206,16 +1116,10 @@
               <w:tab w:val="right" w:leader="dot" w:pos="10070"/>
             </w:tabs>
             <w:rPr>
-              <w:rFonts w:asciiTheme="minorHAnsi" w:eastAsiaTheme="minorEastAsia" w:hAnsiTheme="minorHAnsi" w:cstheme="minorBidi"/>
               <w:noProof/>
-              <w:color w:val="auto"/>
-              <w:kern w:val="2"/>
-              <w:sz w:val="24"/>
-              <w:szCs w:val="24"/>
-              <w14:ligatures w14:val="standardContextual"/>
             </w:rPr>
           </w:pPr>
-          <w:hyperlink w:anchor="_Toc242095250" w:history="1">
+          <w:hyperlink w:anchor="_Toc242098703" w:history="1">
             <w:r>
               <w:rPr>
                 <w:rStyle w:val="Hyperlink"/>
@@ -1239,7 +1143,7 @@
               <w:rPr>
                 <w:noProof/>
               </w:rPr>
-              <w:instrText xml:space="preserve"> PAGEREF _Toc242095250 \h </w:instrText>
+              <w:instrText xml:space="preserve"> PAGEREF _Toc242098703 \h </w:instrText>
             </w:r>
             <w:r>
               <w:rPr>
@@ -1273,16 +1177,10 @@
               <w:tab w:val="right" w:leader="dot" w:pos="10070"/>
             </w:tabs>
             <w:rPr>
-              <w:rFonts w:asciiTheme="minorHAnsi" w:eastAsiaTheme="minorEastAsia" w:hAnsiTheme="minorHAnsi" w:cstheme="minorBidi"/>
               <w:noProof/>
-              <w:color w:val="auto"/>
-              <w:kern w:val="2"/>
-              <w:sz w:val="24"/>
-              <w:szCs w:val="24"/>
-              <w14:ligatures w14:val="standardContextual"/>
             </w:rPr>
           </w:pPr>
-          <w:hyperlink w:anchor="_Toc242095251" w:history="1">
+          <w:hyperlink w:anchor="_Toc242098704" w:history="1">
             <w:r>
               <w:rPr>
                 <w:rStyle w:val="Hyperlink"/>
@@ -1306,7 +1204,7 @@
               <w:rPr>
                 <w:noProof/>
               </w:rPr>
-              <w:instrText xml:space="preserve"> PAGEREF _Toc242095251 \h </w:instrText>
+              <w:instrText xml:space="preserve"> PAGEREF _Toc242098704 \h </w:instrText>
             </w:r>
             <w:r>
               <w:rPr>
@@ -1340,16 +1238,10 @@
               <w:tab w:val="right" w:leader="dot" w:pos="10070"/>
             </w:tabs>
             <w:rPr>
-              <w:rFonts w:asciiTheme="minorHAnsi" w:eastAsiaTheme="minorEastAsia" w:hAnsiTheme="minorHAnsi" w:cstheme="minorBidi"/>
               <w:noProof/>
-              <w:color w:val="auto"/>
-              <w:kern w:val="2"/>
-              <w:sz w:val="24"/>
-              <w:szCs w:val="24"/>
-              <w14:ligatures w14:val="standardContextual"/>
             </w:rPr>
           </w:pPr>
-          <w:hyperlink w:anchor="_Toc242095252" w:history="1">
+          <w:hyperlink w:anchor="_Toc242098705" w:history="1">
             <w:r>
               <w:rPr>
                 <w:rStyle w:val="Hyperlink"/>
@@ -1373,7 +1265,7 @@
               <w:rPr>
                 <w:noProof/>
               </w:rPr>
-              <w:instrText xml:space="preserve"> PAGEREF _Toc242095252 \h </w:instrText>
+              <w:instrText xml:space="preserve"> PAGEREF _Toc242098705 \h </w:instrText>
             </w:r>
             <w:r>
               <w:rPr>
@@ -1407,16 +1299,10 @@
               <w:tab w:val="right" w:leader="dot" w:pos="10070"/>
             </w:tabs>
             <w:rPr>
-              <w:rFonts w:asciiTheme="minorHAnsi" w:eastAsiaTheme="minorEastAsia" w:hAnsiTheme="minorHAnsi" w:cstheme="minorBidi"/>
               <w:noProof/>
-              <w:color w:val="auto"/>
-              <w:kern w:val="2"/>
-              <w:sz w:val="24"/>
-              <w:szCs w:val="24"/>
-              <w14:ligatures w14:val="standardContextual"/>
             </w:rPr>
           </w:pPr>
-          <w:hyperlink w:anchor="_Toc242095253" w:history="1">
+          <w:hyperlink w:anchor="_Toc242098706" w:history="1">
             <w:r>
               <w:rPr>
                 <w:rStyle w:val="Hyperlink"/>
@@ -1440,7 +1326,7 @@
               <w:rPr>
                 <w:noProof/>
               </w:rPr>
-              <w:instrText xml:space="preserve"> PAGEREF _Toc242095253 \h </w:instrText>
+              <w:instrText xml:space="preserve"> PAGEREF _Toc242098706 \h </w:instrText>
             </w:r>
             <w:r>
               <w:rPr>
@@ -1474,16 +1360,10 @@
               <w:tab w:val="right" w:leader="dot" w:pos="10070"/>
             </w:tabs>
             <w:rPr>
-              <w:rFonts w:asciiTheme="minorHAnsi" w:eastAsiaTheme="minorEastAsia" w:hAnsiTheme="minorHAnsi" w:cstheme="minorBidi"/>
               <w:noProof/>
-              <w:color w:val="auto"/>
-              <w:kern w:val="2"/>
-              <w:sz w:val="24"/>
-              <w:szCs w:val="24"/>
-              <w14:ligatures w14:val="standardContextual"/>
             </w:rPr>
           </w:pPr>
-          <w:hyperlink w:anchor="_Toc242095254" w:history="1">
+          <w:hyperlink w:anchor="_Toc242098707" w:history="1">
             <w:r>
               <w:rPr>
                 <w:rStyle w:val="Hyperlink"/>
@@ -1507,7 +1387,7 @@
               <w:rPr>
                 <w:noProof/>
               </w:rPr>
-              <w:instrText xml:space="preserve"> PAGEREF _Toc242095254 \h </w:instrText>
+              <w:instrText xml:space="preserve"> PAGEREF _Toc242098707 \h </w:instrText>
             </w:r>
             <w:r>
               <w:rPr>
@@ -1541,16 +1421,10 @@
               <w:tab w:val="right" w:leader="dot" w:pos="10070"/>
             </w:tabs>
             <w:rPr>
-              <w:rFonts w:asciiTheme="minorHAnsi" w:eastAsiaTheme="minorEastAsia" w:hAnsiTheme="minorHAnsi" w:cstheme="minorBidi"/>
               <w:noProof/>
-              <w:color w:val="auto"/>
-              <w:kern w:val="2"/>
-              <w:sz w:val="24"/>
-              <w:szCs w:val="24"/>
-              <w14:ligatures w14:val="standardContextual"/>
             </w:rPr>
           </w:pPr>
-          <w:hyperlink w:anchor="_Toc242095255" w:history="1">
+          <w:hyperlink w:anchor="_Toc242098708" w:history="1">
             <w:r>
               <w:rPr>
                 <w:rStyle w:val="Hyperlink"/>
@@ -1574,7 +1448,7 @@
               <w:rPr>
                 <w:noProof/>
               </w:rPr>
-              <w:instrText xml:space="preserve"> PAGEREF _Toc242095255 \h </w:instrText>
+              <w:instrText xml:space="preserve"> PAGEREF _Toc242098708 \h </w:instrText>
             </w:r>
             <w:r>
               <w:rPr>
@@ -1608,16 +1482,10 @@
               <w:tab w:val="right" w:leader="dot" w:pos="10070"/>
             </w:tabs>
             <w:rPr>
-              <w:rFonts w:asciiTheme="minorHAnsi" w:eastAsiaTheme="minorEastAsia" w:hAnsiTheme="minorHAnsi" w:cstheme="minorBidi"/>
               <w:noProof/>
-              <w:color w:val="auto"/>
-              <w:kern w:val="2"/>
-              <w:sz w:val="24"/>
-              <w:szCs w:val="24"/>
-              <w14:ligatures w14:val="standardContextual"/>
             </w:rPr>
           </w:pPr>
-          <w:hyperlink w:anchor="_Toc242095256" w:history="1">
+          <w:hyperlink w:anchor="_Toc242098709" w:history="1">
             <w:r>
               <w:rPr>
                 <w:rStyle w:val="Hyperlink"/>
@@ -1641,7 +1509,7 @@
               <w:rPr>
                 <w:noProof/>
               </w:rPr>
-              <w:instrText xml:space="preserve"> PAGEREF _Toc242095256 \h </w:instrText>
+              <w:instrText xml:space="preserve"> PAGEREF _Toc242098709 \h </w:instrText>
             </w:r>
             <w:r>
               <w:rPr>
@@ -1675,16 +1543,10 @@
               <w:tab w:val="right" w:leader="dot" w:pos="10070"/>
             </w:tabs>
             <w:rPr>
-              <w:rFonts w:asciiTheme="minorHAnsi" w:eastAsiaTheme="minorEastAsia" w:hAnsiTheme="minorHAnsi" w:cstheme="minorBidi"/>
               <w:noProof/>
-              <w:color w:val="auto"/>
-              <w:kern w:val="2"/>
-              <w:sz w:val="24"/>
-              <w:szCs w:val="24"/>
-              <w14:ligatures w14:val="standardContextual"/>
             </w:rPr>
           </w:pPr>
-          <w:hyperlink w:anchor="_Toc242095257" w:history="1">
+          <w:hyperlink w:anchor="_Toc242098710" w:history="1">
             <w:r>
               <w:rPr>
                 <w:rStyle w:val="Hyperlink"/>
@@ -1708,7 +1570,7 @@
               <w:rPr>
                 <w:noProof/>
               </w:rPr>
-              <w:instrText xml:space="preserve"> PAGEREF _Toc242095257 \h </w:instrText>
+              <w:instrText xml:space="preserve"> PAGEREF _Toc242098710 \h </w:instrText>
             </w:r>
             <w:r>
               <w:rPr>
@@ -1742,16 +1604,10 @@
               <w:tab w:val="right" w:leader="dot" w:pos="10070"/>
             </w:tabs>
             <w:rPr>
-              <w:rFonts w:asciiTheme="minorHAnsi" w:eastAsiaTheme="minorEastAsia" w:hAnsiTheme="minorHAnsi" w:cstheme="minorBidi"/>
               <w:noProof/>
-              <w:color w:val="auto"/>
-              <w:kern w:val="2"/>
-              <w:sz w:val="24"/>
-              <w:szCs w:val="24"/>
-              <w14:ligatures w14:val="standardContextual"/>
             </w:rPr>
           </w:pPr>
-          <w:hyperlink w:anchor="_Toc242095258" w:history="1">
+          <w:hyperlink w:anchor="_Toc242098711" w:history="1">
             <w:r>
               <w:rPr>
                 <w:rStyle w:val="Hyperlink"/>
@@ -1775,7 +1631,7 @@
               <w:rPr>
                 <w:noProof/>
               </w:rPr>
-              <w:instrText xml:space="preserve"> PAGEREF _Toc242095258 \h </w:instrText>
+              <w:instrText xml:space="preserve"> PAGEREF _Toc242098711 \h </w:instrText>
             </w:r>
             <w:r>
               <w:rPr>
@@ -1809,16 +1665,10 @@
               <w:tab w:val="right" w:leader="dot" w:pos="10070"/>
             </w:tabs>
             <w:rPr>
-              <w:rFonts w:asciiTheme="minorHAnsi" w:eastAsiaTheme="minorEastAsia" w:hAnsiTheme="minorHAnsi" w:cstheme="minorBidi"/>
               <w:noProof/>
-              <w:color w:val="auto"/>
-              <w:kern w:val="2"/>
-              <w:sz w:val="24"/>
-              <w:szCs w:val="24"/>
-              <w14:ligatures w14:val="standardContextual"/>
             </w:rPr>
           </w:pPr>
-          <w:hyperlink w:anchor="_Toc242095259" w:history="1">
+          <w:hyperlink w:anchor="_Toc242098712" w:history="1">
             <w:r>
               <w:rPr>
                 <w:rStyle w:val="Hyperlink"/>
@@ -1842,7 +1692,7 @@
               <w:rPr>
                 <w:noProof/>
               </w:rPr>
-              <w:instrText xml:space="preserve"> PAGEREF _Toc242095259 \h </w:instrText>
+              <w:instrText xml:space="preserve"> PAGEREF _Toc242098712 \h </w:instrText>
             </w:r>
             <w:r>
               <w:rPr>
@@ -1876,16 +1726,10 @@
               <w:tab w:val="right" w:leader="dot" w:pos="10070"/>
             </w:tabs>
             <w:rPr>
-              <w:rFonts w:asciiTheme="minorHAnsi" w:eastAsiaTheme="minorEastAsia" w:hAnsiTheme="minorHAnsi" w:cstheme="minorBidi"/>
               <w:noProof/>
-              <w:color w:val="auto"/>
-              <w:kern w:val="2"/>
-              <w:sz w:val="24"/>
-              <w:szCs w:val="24"/>
-              <w14:ligatures w14:val="standardContextual"/>
             </w:rPr>
           </w:pPr>
-          <w:hyperlink w:anchor="_Toc242095260" w:history="1">
+          <w:hyperlink w:anchor="_Toc242098713" w:history="1">
             <w:r>
               <w:rPr>
                 <w:rStyle w:val="Hyperlink"/>
@@ -1909,7 +1753,7 @@
               <w:rPr>
                 <w:noProof/>
               </w:rPr>
-              <w:instrText xml:space="preserve"> PAGEREF _Toc242095260 \h </w:instrText>
+              <w:instrText xml:space="preserve"> PAGEREF _Toc242098713 \h </w:instrText>
             </w:r>
             <w:r>
               <w:rPr>
@@ -1943,16 +1787,10 @@
               <w:tab w:val="right" w:leader="dot" w:pos="10070"/>
             </w:tabs>
             <w:rPr>
-              <w:rFonts w:asciiTheme="minorHAnsi" w:eastAsiaTheme="minorEastAsia" w:hAnsiTheme="minorHAnsi" w:cstheme="minorBidi"/>
               <w:noProof/>
-              <w:color w:val="auto"/>
-              <w:kern w:val="2"/>
-              <w:sz w:val="24"/>
-              <w:szCs w:val="24"/>
-              <w14:ligatures w14:val="standardContextual"/>
             </w:rPr>
           </w:pPr>
-          <w:hyperlink w:anchor="_Toc242095261" w:history="1">
+          <w:hyperlink w:anchor="_Toc242098714" w:history="1">
             <w:r>
               <w:rPr>
                 <w:rStyle w:val="Hyperlink"/>
@@ -1976,7 +1814,7 @@
               <w:rPr>
                 <w:noProof/>
               </w:rPr>
-              <w:instrText xml:space="preserve"> PAGEREF _Toc242095261 \h </w:instrText>
+              <w:instrText xml:space="preserve"> PAGEREF _Toc242098714 \h </w:instrText>
             </w:r>
             <w:r>
               <w:rPr>
@@ -2010,16 +1848,10 @@
               <w:tab w:val="right" w:leader="dot" w:pos="10070"/>
             </w:tabs>
             <w:rPr>
-              <w:rFonts w:asciiTheme="minorHAnsi" w:eastAsiaTheme="minorEastAsia" w:hAnsiTheme="minorHAnsi" w:cstheme="minorBidi"/>
               <w:noProof/>
-              <w:color w:val="auto"/>
-              <w:kern w:val="2"/>
-              <w:sz w:val="24"/>
-              <w:szCs w:val="24"/>
-              <w14:ligatures w14:val="standardContextual"/>
             </w:rPr>
           </w:pPr>
-          <w:hyperlink w:anchor="_Toc242095262" w:history="1">
+          <w:hyperlink w:anchor="_Toc242098715" w:history="1">
             <w:r>
               <w:rPr>
                 <w:rStyle w:val="Hyperlink"/>
@@ -2043,7 +1875,7 @@
               <w:rPr>
                 <w:noProof/>
               </w:rPr>
-              <w:instrText xml:space="preserve"> PAGEREF _Toc242095262 \h </w:instrText>
+              <w:instrText xml:space="preserve"> PAGEREF _Toc242098715 \h </w:instrText>
             </w:r>
             <w:r>
               <w:rPr>
@@ -2077,16 +1909,10 @@
               <w:tab w:val="right" w:leader="dot" w:pos="10070"/>
             </w:tabs>
             <w:rPr>
-              <w:rFonts w:asciiTheme="minorHAnsi" w:eastAsiaTheme="minorEastAsia" w:hAnsiTheme="minorHAnsi" w:cstheme="minorBidi"/>
               <w:noProof/>
-              <w:color w:val="auto"/>
-              <w:kern w:val="2"/>
-              <w:sz w:val="24"/>
-              <w:szCs w:val="24"/>
-              <w14:ligatures w14:val="standardContextual"/>
             </w:rPr>
           </w:pPr>
-          <w:hyperlink w:anchor="_Toc242095263" w:history="1">
+          <w:hyperlink w:anchor="_Toc242098716" w:history="1">
             <w:r>
               <w:rPr>
                 <w:rStyle w:val="Hyperlink"/>
@@ -2110,7 +1936,7 @@
               <w:rPr>
                 <w:noProof/>
               </w:rPr>
-              <w:instrText xml:space="preserve"> PAGEREF _Toc242095263 \h </w:instrText>
+              <w:instrText xml:space="preserve"> PAGEREF _Toc242098716 \h </w:instrText>
             </w:r>
             <w:r>
               <w:rPr>
@@ -2144,16 +1970,10 @@
               <w:tab w:val="right" w:leader="dot" w:pos="10070"/>
             </w:tabs>
             <w:rPr>
-              <w:rFonts w:asciiTheme="minorHAnsi" w:eastAsiaTheme="minorEastAsia" w:hAnsiTheme="minorHAnsi" w:cstheme="minorBidi"/>
               <w:noProof/>
-              <w:color w:val="auto"/>
-              <w:kern w:val="2"/>
-              <w:sz w:val="24"/>
-              <w:szCs w:val="24"/>
-              <w14:ligatures w14:val="standardContextual"/>
             </w:rPr>
           </w:pPr>
-          <w:hyperlink w:anchor="_Toc242095264" w:history="1">
+          <w:hyperlink w:anchor="_Toc242098717" w:history="1">
             <w:r>
               <w:rPr>
                 <w:rStyle w:val="Hyperlink"/>
@@ -2177,7 +1997,7 @@
               <w:rPr>
                 <w:noProof/>
               </w:rPr>
-              <w:instrText xml:space="preserve"> PAGEREF _Toc242095264 \h </w:instrText>
+              <w:instrText xml:space="preserve"> PAGEREF _Toc242098717 \h </w:instrText>
             </w:r>
             <w:r>
               <w:rPr>
@@ -2211,16 +2031,10 @@
               <w:tab w:val="right" w:leader="dot" w:pos="10070"/>
             </w:tabs>
             <w:rPr>
-              <w:rFonts w:asciiTheme="minorHAnsi" w:eastAsiaTheme="minorEastAsia" w:hAnsiTheme="minorHAnsi" w:cstheme="minorBidi"/>
               <w:noProof/>
-              <w:color w:val="auto"/>
-              <w:kern w:val="2"/>
-              <w:sz w:val="24"/>
-              <w:szCs w:val="24"/>
-              <w14:ligatures w14:val="standardContextual"/>
             </w:rPr>
           </w:pPr>
-          <w:hyperlink w:anchor="_Toc242095265" w:history="1">
+          <w:hyperlink w:anchor="_Toc242098718" w:history="1">
             <w:r>
               <w:rPr>
                 <w:rStyle w:val="Hyperlink"/>
@@ -2244,7 +2058,7 @@
               <w:rPr>
                 <w:noProof/>
               </w:rPr>
-              <w:instrText xml:space="preserve"> PAGEREF _Toc242095265 \h </w:instrText>
+              <w:instrText xml:space="preserve"> PAGEREF _Toc242098718 \h </w:instrText>
             </w:r>
             <w:r>
               <w:rPr>
@@ -2278,16 +2092,10 @@
               <w:tab w:val="right" w:leader="dot" w:pos="10070"/>
             </w:tabs>
             <w:rPr>
-              <w:rFonts w:asciiTheme="minorHAnsi" w:eastAsiaTheme="minorEastAsia" w:hAnsiTheme="minorHAnsi" w:cstheme="minorBidi"/>
               <w:noProof/>
-              <w:color w:val="auto"/>
-              <w:kern w:val="2"/>
-              <w:sz w:val="24"/>
-              <w:szCs w:val="24"/>
-              <w14:ligatures w14:val="standardContextual"/>
             </w:rPr>
           </w:pPr>
-          <w:hyperlink w:anchor="_Toc242095266" w:history="1">
+          <w:hyperlink w:anchor="_Toc242098719" w:history="1">
             <w:r>
               <w:rPr>
                 <w:rStyle w:val="Hyperlink"/>
@@ -2311,7 +2119,7 @@
               <w:rPr>
                 <w:noProof/>
               </w:rPr>
-              <w:instrText xml:space="preserve"> PAGEREF _Toc242095266 \h </w:instrText>
+              <w:instrText xml:space="preserve"> PAGEREF _Toc242098719 \h </w:instrText>
             </w:r>
             <w:r>
               <w:rPr>
@@ -2345,16 +2153,10 @@
               <w:tab w:val="right" w:leader="dot" w:pos="10070"/>
             </w:tabs>
             <w:rPr>
-              <w:rFonts w:asciiTheme="minorHAnsi" w:eastAsiaTheme="minorEastAsia" w:hAnsiTheme="minorHAnsi" w:cstheme="minorBidi"/>
               <w:noProof/>
-              <w:color w:val="auto"/>
-              <w:kern w:val="2"/>
-              <w:sz w:val="24"/>
-              <w:szCs w:val="24"/>
-              <w14:ligatures w14:val="standardContextual"/>
             </w:rPr>
           </w:pPr>
-          <w:hyperlink w:anchor="_Toc242095267" w:history="1">
+          <w:hyperlink w:anchor="_Toc242098720" w:history="1">
             <w:r>
               <w:rPr>
                 <w:rStyle w:val="Hyperlink"/>
@@ -2378,7 +2180,7 @@
               <w:rPr>
                 <w:noProof/>
               </w:rPr>
-              <w:instrText xml:space="preserve"> PAGEREF _Toc242095267 \h </w:instrText>
+              <w:instrText xml:space="preserve"> PAGEREF _Toc242098720 \h </w:instrText>
             </w:r>
             <w:r>
               <w:rPr>
@@ -2412,16 +2214,10 @@
               <w:tab w:val="right" w:leader="dot" w:pos="10070"/>
             </w:tabs>
             <w:rPr>
-              <w:rFonts w:asciiTheme="minorHAnsi" w:eastAsiaTheme="minorEastAsia" w:hAnsiTheme="minorHAnsi" w:cstheme="minorBidi"/>
               <w:noProof/>
-              <w:color w:val="auto"/>
-              <w:kern w:val="2"/>
-              <w:sz w:val="24"/>
-              <w:szCs w:val="24"/>
-              <w14:ligatures w14:val="standardContextual"/>
             </w:rPr>
           </w:pPr>
-          <w:hyperlink w:anchor="_Toc242095268" w:history="1">
+          <w:hyperlink w:anchor="_Toc242098721" w:history="1">
             <w:r>
               <w:rPr>
                 <w:rStyle w:val="Hyperlink"/>
@@ -2445,7 +2241,7 @@
               <w:rPr>
                 <w:noProof/>
               </w:rPr>
-              <w:instrText xml:space="preserve"> PAGEREF _Toc242095268 \h </w:instrText>
+              <w:instrText xml:space="preserve"> PAGEREF _Toc242098721 \h </w:instrText>
             </w:r>
             <w:r>
               <w:rPr>
@@ -2485,7 +2281,7 @@
         <w:keepNext/>
         <w:pageBreakBefore/>
       </w:pPr>
-      <w:bookmarkStart w:id="0" w:name="_Toc242095235"/>
+      <w:bookmarkStart w:id="0" w:name="_Toc242098688"/>
       <w:r>
         <w:t>1. Introduction</w:t>
       </w:r>
@@ -2496,7 +2292,7 @@
         <w:pStyle w:val="Heading2"/>
         <w:keepNext/>
       </w:pPr>
-      <w:bookmarkStart w:id="1" w:name="_Toc242095236"/>
+      <w:bookmarkStart w:id="1" w:name="_Toc242098689"/>
       <w:r>
         <w:t>1.1 Why Amadeus NDC Fare Rules &amp; Amenities AI Switch</w:t>
       </w:r>
@@ -2698,7 +2494,7 @@
         <w:pStyle w:val="Heading2"/>
         <w:keepNext/>
       </w:pPr>
-      <w:bookmarkStart w:id="2" w:name="_Toc242095237"/>
+      <w:bookmarkStart w:id="2" w:name="_Toc242098690"/>
       <w:r>
         <w:t>1.2 What you get</w:t>
       </w:r>
@@ -3327,7 +3123,7 @@
         <w:pStyle w:val="Heading2"/>
         <w:keepNext/>
       </w:pPr>
-      <w:bookmarkStart w:id="3" w:name="_Toc242095238"/>
+      <w:bookmarkStart w:id="3" w:name="_Toc242098691"/>
       <w:r>
         <w:t>1.3 The admin interface at a glance</w:t>
       </w:r>
@@ -3344,10 +3140,10 @@
           <w:noProof/>
         </w:rPr>
         <w:drawing>
-          <wp:inline distT="0" distB="0" distL="0" distR="0" wp14:anchorId="02944217" wp14:editId="0CB8193E">
+          <wp:inline distT="0" distB="0" distL="0" distR="0" wp14:anchorId="64E330AF" wp14:editId="7ACF8FB3">
             <wp:extent cx="6400800" cy="4000500"/>
             <wp:effectExtent l="0" t="0" r="0" b="0"/>
-            <wp:docPr id="521113998" name="Picture 521113998"/>
+            <wp:docPr id="954175807" name="Picture 954175807"/>
             <wp:cNvGraphicFramePr>
               <a:graphicFrameLocks xmlns:a="http://schemas.openxmlformats.org/drawingml/2006/main" noChangeAspect="1"/>
             </wp:cNvGraphicFramePr>
@@ -3405,7 +3201,7 @@
         <w:keepNext/>
         <w:pageBreakBefore/>
       </w:pPr>
-      <w:bookmarkStart w:id="4" w:name="_Toc242095239"/>
+      <w:bookmarkStart w:id="4" w:name="_Toc242098692"/>
       <w:r>
         <w:t>2. Quick start</w:t>
       </w:r>
@@ -3424,7 +3220,7 @@
         <w:pStyle w:val="Heading2"/>
         <w:keepNext/>
       </w:pPr>
-      <w:bookmarkStart w:id="5" w:name="_Toc242095240"/>
+      <w:bookmarkStart w:id="5" w:name="_Toc242098693"/>
       <w:r>
         <w:t>2.1 Run it</w:t>
       </w:r>
@@ -3529,7 +3325,7 @@
         <w:pStyle w:val="Heading2"/>
         <w:keepNext/>
       </w:pPr>
-      <w:bookmarkStart w:id="6" w:name="_Toc242095241"/>
+      <w:bookmarkStart w:id="6" w:name="_Toc242098694"/>
       <w:r>
         <w:t>2.2 Choose an LLM provider</w:t>
       </w:r>
@@ -3574,10 +3370,10 @@
           <w:noProof/>
         </w:rPr>
         <w:drawing>
-          <wp:inline distT="0" distB="0" distL="0" distR="0" wp14:anchorId="0DAD0B70" wp14:editId="429C7CBA">
+          <wp:inline distT="0" distB="0" distL="0" distR="0" wp14:anchorId="07C8B5F9" wp14:editId="39F9D352">
             <wp:extent cx="6400800" cy="4000500"/>
             <wp:effectExtent l="0" t="0" r="0" b="0"/>
-            <wp:docPr id="1998705984" name="Picture 1998705984"/>
+            <wp:docPr id="1555450856" name="Picture 1555450856"/>
             <wp:cNvGraphicFramePr>
               <a:graphicFrameLocks xmlns:a="http://schemas.openxmlformats.org/drawingml/2006/main" noChangeAspect="1"/>
             </wp:cNvGraphicFramePr>
@@ -3634,7 +3430,7 @@
         <w:pStyle w:val="Heading2"/>
         <w:keepNext/>
       </w:pPr>
-      <w:bookmarkStart w:id="7" w:name="_Toc242095242"/>
+      <w:bookmarkStart w:id="7" w:name="_Toc242098695"/>
       <w:r>
         <w:t>2.3 Create an API key</w:t>
       </w:r>
@@ -3659,10 +3455,10 @@
           <w:noProof/>
         </w:rPr>
         <w:drawing>
-          <wp:inline distT="0" distB="0" distL="0" distR="0" wp14:anchorId="0869CD3E" wp14:editId="5DF38143">
+          <wp:inline distT="0" distB="0" distL="0" distR="0" wp14:anchorId="402CBDAA" wp14:editId="0F750A89">
             <wp:extent cx="6400800" cy="4000500"/>
             <wp:effectExtent l="0" t="0" r="0" b="0"/>
-            <wp:docPr id="453056715" name="Picture 453056715"/>
+            <wp:docPr id="1449286359" name="Picture 1449286359"/>
             <wp:cNvGraphicFramePr>
               <a:graphicFrameLocks xmlns:a="http://schemas.openxmlformats.org/drawingml/2006/main" noChangeAspect="1"/>
             </wp:cNvGraphicFramePr>
@@ -3719,7 +3515,7 @@
         <w:pStyle w:val="Heading2"/>
         <w:keepNext/>
       </w:pPr>
-      <w:bookmarkStart w:id="8" w:name="_Toc242095243"/>
+      <w:bookmarkStart w:id="8" w:name="_Toc242098696"/>
       <w:r>
         <w:t>2.4 Call the API</w:t>
       </w:r>
@@ -3813,7 +3609,7 @@
         <w:pStyle w:val="Heading2"/>
         <w:keepNext/>
       </w:pPr>
-      <w:bookmarkStart w:id="9" w:name="_Toc242095244"/>
+      <w:bookmarkStart w:id="9" w:name="_Toc242098697"/>
       <w:r>
         <w:t>2.5 Try it in the Playground</w:t>
       </w:r>
@@ -3838,10 +3634,10 @@
           <w:noProof/>
         </w:rPr>
         <w:drawing>
-          <wp:inline distT="0" distB="0" distL="0" distR="0" wp14:anchorId="61B2DAF4" wp14:editId="2586A6E6">
+          <wp:inline distT="0" distB="0" distL="0" distR="0" wp14:anchorId="1821F334" wp14:editId="697BC5AA">
             <wp:extent cx="6400800" cy="4000500"/>
             <wp:effectExtent l="0" t="0" r="0" b="0"/>
-            <wp:docPr id="40682468" name="Picture 40682468"/>
+            <wp:docPr id="1754988685" name="Picture 1754988685"/>
             <wp:cNvGraphicFramePr>
               <a:graphicFrameLocks xmlns:a="http://schemas.openxmlformats.org/drawingml/2006/main" noChangeAspect="1"/>
             </wp:cNvGraphicFramePr>
@@ -3904,10 +3700,10 @@
           <w:noProof/>
         </w:rPr>
         <w:drawing>
-          <wp:inline distT="0" distB="0" distL="0" distR="0" wp14:anchorId="39BD7A61" wp14:editId="350CB740">
+          <wp:inline distT="0" distB="0" distL="0" distR="0" wp14:anchorId="4C5AF84D" wp14:editId="58F4913D">
             <wp:extent cx="6400800" cy="4000500"/>
             <wp:effectExtent l="0" t="0" r="0" b="0"/>
-            <wp:docPr id="316402974" name="Picture 316402974"/>
+            <wp:docPr id="718428434" name="Picture 718428434"/>
             <wp:cNvGraphicFramePr>
               <a:graphicFrameLocks xmlns:a="http://schemas.openxmlformats.org/drawingml/2006/main" noChangeAspect="1"/>
             </wp:cNvGraphicFramePr>
@@ -3964,7 +3760,7 @@
         <w:pStyle w:val="Heading2"/>
         <w:keepNext/>
       </w:pPr>
-      <w:bookmarkStart w:id="10" w:name="_Toc242095245"/>
+      <w:bookmarkStart w:id="10" w:name="_Toc242098698"/>
       <w:r>
         <w:t>2.6 Watch usage</w:t>
       </w:r>
@@ -3989,10 +3785,10 @@
           <w:noProof/>
         </w:rPr>
         <w:drawing>
-          <wp:inline distT="0" distB="0" distL="0" distR="0" wp14:anchorId="43DEEE30" wp14:editId="5A647C68">
-            <wp:extent cx="4648200" cy="7429500"/>
+          <wp:inline distT="0" distB="0" distL="0" distR="0" wp14:anchorId="3974C73F" wp14:editId="500C9FEA">
+            <wp:extent cx="4371975" cy="7429500"/>
             <wp:effectExtent l="0" t="0" r="0" b="0"/>
-            <wp:docPr id="1348277566" name="Picture 1348277566"/>
+            <wp:docPr id="1637435963" name="Picture 1637435963"/>
             <wp:cNvGraphicFramePr>
               <a:graphicFrameLocks xmlns:a="http://schemas.openxmlformats.org/drawingml/2006/main" noChangeAspect="1"/>
             </wp:cNvGraphicFramePr>
@@ -4015,7 +3811,7 @@
                   <pic:spPr bwMode="auto">
                     <a:xfrm>
                       <a:off x="0" y="0"/>
-                      <a:ext cx="4648200" cy="7429500"/>
+                      <a:ext cx="4371975" cy="7429500"/>
                     </a:xfrm>
                     <a:prstGeom prst="rect">
                       <a:avLst/>
@@ -4050,7 +3846,7 @@
         <w:keepNext/>
         <w:pageBreakBefore/>
       </w:pPr>
-      <w:bookmarkStart w:id="11" w:name="_Toc242095246"/>
+      <w:bookmarkStart w:id="11" w:name="_Toc242098699"/>
       <w:r>
         <w:t>3. API reference</w:t>
       </w:r>
@@ -4061,7 +3857,7 @@
         <w:pStyle w:val="Heading2"/>
         <w:keepNext/>
       </w:pPr>
-      <w:bookmarkStart w:id="12" w:name="_Toc242095247"/>
+      <w:bookmarkStart w:id="12" w:name="_Toc242098700"/>
       <w:r>
         <w:t>3.1 Authentication and errors</w:t>
       </w:r>
@@ -4769,7 +4565,7 @@
         <w:pStyle w:val="Heading2"/>
         <w:keepNext/>
       </w:pPr>
-      <w:bookmarkStart w:id="13" w:name="_Toc242095248"/>
+      <w:bookmarkStart w:id="13" w:name="_Toc242098701"/>
       <w:r>
         <w:t>3.2 POST /api/v1/fare-rules/summary</w:t>
       </w:r>
@@ -5404,7 +5200,7 @@
         <w:pStyle w:val="Heading2"/>
         <w:keepNext/>
       </w:pPr>
-      <w:bookmarkStart w:id="14" w:name="_Toc242095249"/>
+      <w:bookmarkStart w:id="14" w:name="_Toc242098702"/>
       <w:r>
         <w:t>3.3 POST /api/v1/fare-rules/chat/stream</w:t>
       </w:r>
@@ -5759,7 +5555,7 @@
         <w:pStyle w:val="Heading2"/>
         <w:keepNext/>
       </w:pPr>
-      <w:bookmarkStart w:id="15" w:name="_Toc242095250"/>
+      <w:bookmarkStart w:id="15" w:name="_Toc242098703"/>
       <w:r>
         <w:t>3.4 Other endpoints</w:t>
       </w:r>
@@ -6107,7 +5903,7 @@
         <w:pStyle w:val="Heading2"/>
         <w:keepNext/>
       </w:pPr>
-      <w:bookmarkStart w:id="16" w:name="_Toc242095251"/>
+      <w:bookmarkStart w:id="16" w:name="_Toc242098704"/>
       <w:r>
         <w:t>3.5 POST /api/v1/amenities/summary</w:t>
       </w:r>
@@ -6762,10 +6558,10 @@
           <w:noProof/>
         </w:rPr>
         <w:drawing>
-          <wp:inline distT="0" distB="0" distL="0" distR="0" wp14:anchorId="5C057ADF" wp14:editId="594795BA">
+          <wp:inline distT="0" distB="0" distL="0" distR="0" wp14:anchorId="0F5FC0A8" wp14:editId="676EAF0A">
             <wp:extent cx="6400800" cy="4000500"/>
             <wp:effectExtent l="0" t="0" r="0" b="0"/>
-            <wp:docPr id="434310072" name="Picture 434310072"/>
+            <wp:docPr id="868914693" name="Picture 868914693"/>
             <wp:cNvGraphicFramePr>
               <a:graphicFrameLocks xmlns:a="http://schemas.openxmlformats.org/drawingml/2006/main" noChangeAspect="1"/>
             </wp:cNvGraphicFramePr>
@@ -6822,7 +6618,7 @@
         <w:pStyle w:val="Heading2"/>
         <w:keepNext/>
       </w:pPr>
-      <w:bookmarkStart w:id="17" w:name="_Toc242095252"/>
+      <w:bookmarkStart w:id="17" w:name="_Toc242098705"/>
       <w:r>
         <w:t>3.6 POST /api/v1/amenities/fare-names</w:t>
       </w:r>
@@ -6882,10 +6678,10 @@
           <w:noProof/>
         </w:rPr>
         <w:drawing>
-          <wp:inline distT="0" distB="0" distL="0" distR="0" wp14:anchorId="2A47DCCF" wp14:editId="21EEBBAE">
+          <wp:inline distT="0" distB="0" distL="0" distR="0" wp14:anchorId="1C3E13D0" wp14:editId="148ACBBC">
             <wp:extent cx="6400800" cy="4000500"/>
             <wp:effectExtent l="0" t="0" r="0" b="0"/>
-            <wp:docPr id="413608353" name="Picture 413608353"/>
+            <wp:docPr id="987476609" name="Picture 987476609"/>
             <wp:cNvGraphicFramePr>
               <a:graphicFrameLocks xmlns:a="http://schemas.openxmlformats.org/drawingml/2006/main" noChangeAspect="1"/>
             </wp:cNvGraphicFramePr>
@@ -6942,7 +6738,7 @@
         <w:pStyle w:val="Heading2"/>
         <w:keepNext/>
       </w:pPr>
-      <w:bookmarkStart w:id="18" w:name="_Toc242095253"/>
+      <w:bookmarkStart w:id="18" w:name="_Toc242098706"/>
       <w:r>
         <w:t>3.7 Interactive documentation (Swagger UI)</w:t>
       </w:r>
@@ -7006,10 +6802,10 @@
           <w:noProof/>
         </w:rPr>
         <w:drawing>
-          <wp:inline distT="0" distB="0" distL="0" distR="0" wp14:anchorId="5EA2CAD1" wp14:editId="264B8E24">
+          <wp:inline distT="0" distB="0" distL="0" distR="0" wp14:anchorId="2BB6B57A" wp14:editId="1B5CDC6B">
             <wp:extent cx="6400800" cy="7229475"/>
             <wp:effectExtent l="0" t="0" r="0" b="0"/>
-            <wp:docPr id="794117570" name="Picture 794117570"/>
+            <wp:docPr id="3443672" name="Picture 3443672"/>
             <wp:cNvGraphicFramePr>
               <a:graphicFrameLocks xmlns:a="http://schemas.openxmlformats.org/drawingml/2006/main" noChangeAspect="1"/>
             </wp:cNvGraphicFramePr>
@@ -7072,10 +6868,10 @@
           <w:noProof/>
         </w:rPr>
         <w:drawing>
-          <wp:inline distT="0" distB="0" distL="0" distR="0" wp14:anchorId="3B98C93B" wp14:editId="6F6CA137">
+          <wp:inline distT="0" distB="0" distL="0" distR="0" wp14:anchorId="5480B934" wp14:editId="694DF2E7">
             <wp:extent cx="3886200" cy="7429500"/>
             <wp:effectExtent l="0" t="0" r="0" b="0"/>
-            <wp:docPr id="968528102" name="Picture 968528102"/>
+            <wp:docPr id="1308889032" name="Picture 1308889032"/>
             <wp:cNvGraphicFramePr>
               <a:graphicFrameLocks xmlns:a="http://schemas.openxmlformats.org/drawingml/2006/main" noChangeAspect="1"/>
             </wp:cNvGraphicFramePr>
@@ -7133,7 +6929,7 @@
         <w:keepNext/>
         <w:pageBreakBefore/>
       </w:pPr>
-      <w:bookmarkStart w:id="19" w:name="_Toc242095254"/>
+      <w:bookmarkStart w:id="19" w:name="_Toc242098707"/>
       <w:r>
         <w:t>4. Configuration</w:t>
       </w:r>
@@ -7178,7 +6974,7 @@
         <w:pStyle w:val="Heading2"/>
         <w:keepNext/>
       </w:pPr>
-      <w:bookmarkStart w:id="20" w:name="_Toc242095255"/>
+      <w:bookmarkStart w:id="20" w:name="_Toc242098708"/>
       <w:r>
         <w:t>4.1 Environment variables</w:t>
       </w:r>
@@ -8419,7 +8215,7 @@
         <w:pStyle w:val="Heading2"/>
         <w:keepNext/>
       </w:pPr>
-      <w:bookmarkStart w:id="21" w:name="_Toc242095256"/>
+      <w:bookmarkStart w:id="21" w:name="_Toc242098709"/>
       <w:r>
         <w:t>4.2 LLM providers</w:t>
       </w:r>
@@ -9080,7 +8876,7 @@
         <w:pStyle w:val="Heading2"/>
         <w:keepNext/>
       </w:pPr>
-      <w:bookmarkStart w:id="22" w:name="_Toc242095257"/>
+      <w:bookmarkStart w:id="22" w:name="_Toc242098710"/>
       <w:r>
         <w:t>4.3 Using your own Postgres / Redis</w:t>
       </w:r>
@@ -9115,10 +8911,10 @@
           <w:noProof/>
         </w:rPr>
         <w:drawing>
-          <wp:inline distT="0" distB="0" distL="0" distR="0" wp14:anchorId="3571B171" wp14:editId="65B11CA2">
+          <wp:inline distT="0" distB="0" distL="0" distR="0" wp14:anchorId="6E6C8126" wp14:editId="53A38AF6">
             <wp:extent cx="6400800" cy="4000500"/>
             <wp:effectExtent l="0" t="0" r="0" b="0"/>
-            <wp:docPr id="1847336136" name="Picture 1847336136"/>
+            <wp:docPr id="601135621" name="Picture 601135621"/>
             <wp:cNvGraphicFramePr>
               <a:graphicFrameLocks xmlns:a="http://schemas.openxmlformats.org/drawingml/2006/main" noChangeAspect="1"/>
             </wp:cNvGraphicFramePr>
@@ -9175,7 +8971,7 @@
         <w:pStyle w:val="Heading2"/>
         <w:keepNext/>
       </w:pPr>
-      <w:bookmarkStart w:id="23" w:name="_Toc242095258"/>
+      <w:bookmarkStart w:id="23" w:name="_Toc242098711"/>
       <w:r>
         <w:t>4.4 Prompts</w:t>
       </w:r>
@@ -9210,10 +9006,10 @@
           <w:noProof/>
         </w:rPr>
         <w:drawing>
-          <wp:inline distT="0" distB="0" distL="0" distR="0" wp14:anchorId="56A451DC" wp14:editId="78E54B0C">
+          <wp:inline distT="0" distB="0" distL="0" distR="0" wp14:anchorId="4416D875" wp14:editId="3B7AD938">
             <wp:extent cx="6400800" cy="4000500"/>
             <wp:effectExtent l="0" t="0" r="0" b="0"/>
-            <wp:docPr id="1711704698" name="Picture 1711704698"/>
+            <wp:docPr id="1352944366" name="Picture 1352944366"/>
             <wp:cNvGraphicFramePr>
               <a:graphicFrameLocks xmlns:a="http://schemas.openxmlformats.org/drawingml/2006/main" noChangeAspect="1"/>
             </wp:cNvGraphicFramePr>
@@ -9344,7 +9140,7 @@
         <w:keepNext/>
         <w:pageBreakBefore/>
       </w:pPr>
-      <w:bookmarkStart w:id="24" w:name="_Toc242095259"/>
+      <w:bookmarkStart w:id="24" w:name="_Toc242098712"/>
       <w:r>
         <w:t>5. Architecture</w:t>
       </w:r>
@@ -9355,7 +9151,7 @@
         <w:pStyle w:val="Heading2"/>
         <w:keepNext/>
       </w:pPr>
-      <w:bookmarkStart w:id="25" w:name="_Toc242095260"/>
+      <w:bookmarkStart w:id="25" w:name="_Toc242098713"/>
       <w:r>
         <w:t>5.1 Request flow</w:t>
       </w:r>
@@ -9478,7 +9274,7 @@
         <w:pStyle w:val="Heading2"/>
         <w:keepNext/>
       </w:pPr>
-      <w:bookmarkStart w:id="26" w:name="_Toc242095261"/>
+      <w:bookmarkStart w:id="26" w:name="_Toc242098714"/>
       <w:r>
         <w:t>5.2 Code layout</w:t>
       </w:r>
@@ -9644,7 +9440,7 @@
         <w:pStyle w:val="Heading2"/>
         <w:keepNext/>
       </w:pPr>
-      <w:bookmarkStart w:id="27" w:name="_Toc242095262"/>
+      <w:bookmarkStart w:id="27" w:name="_Toc242098715"/>
       <w:r>
         <w:t>5.3 Technology</w:t>
       </w:r>
@@ -10040,7 +9836,7 @@
         <w:keepNext/>
         <w:pageBreakBefore/>
       </w:pPr>
-      <w:bookmarkStart w:id="28" w:name="_Toc242095263"/>
+      <w:bookmarkStart w:id="28" w:name="_Toc242098716"/>
       <w:r>
         <w:t>6. Deployment</w:t>
       </w:r>
@@ -10051,7 +9847,7 @@
         <w:pStyle w:val="Heading2"/>
         <w:keepNext/>
       </w:pPr>
-      <w:bookmarkStart w:id="29" w:name="_Toc242095264"/>
+      <w:bookmarkStart w:id="29" w:name="_Toc242098717"/>
       <w:r>
         <w:t>6.1 Production checklist</w:t>
       </w:r>
@@ -10179,7 +9975,7 @@
         <w:pStyle w:val="Heading2"/>
         <w:keepNext/>
       </w:pPr>
-      <w:bookmarkStart w:id="30" w:name="_Toc242095265"/>
+      <w:bookmarkStart w:id="30" w:name="_Toc242098718"/>
       <w:r>
         <w:t>6.2 Reverse proxy</w:t>
       </w:r>
@@ -10361,7 +10157,7 @@
         <w:pStyle w:val="Heading2"/>
         <w:keepNext/>
       </w:pPr>
-      <w:bookmarkStart w:id="31" w:name="_Toc242095266"/>
+      <w:bookmarkStart w:id="31" w:name="_Toc242098719"/>
       <w:r>
         <w:t>6.3 Scaling, persistence and upgrades</w:t>
       </w:r>
@@ -10502,7 +10298,7 @@
         <w:pStyle w:val="Heading2"/>
         <w:keepNext/>
       </w:pPr>
-      <w:bookmarkStart w:id="32" w:name="_Toc242095267"/>
+      <w:bookmarkStart w:id="32" w:name="_Toc242098720"/>
       <w:r>
         <w:t>6.4 What Amadeus NDC Fare Rules &amp; Amenities AI Switch stores</w:t>
       </w:r>
@@ -11253,7 +11049,7 @@
         <w:keepNext/>
         <w:pageBreakBefore/>
       </w:pPr>
-      <w:bookmarkStart w:id="33" w:name="_Toc242095268"/>
+      <w:bookmarkStart w:id="33" w:name="_Toc242098721"/>
       <w:r>
         <w:t>7. Contributing, credits and license</w:t>
       </w:r>
@@ -11555,118 +11351,118 @@
 <file path=word/numbering.xml><?xml version="1.0" encoding="utf-8"?>
 <w:numbering xmlns:wpc="http://schemas.microsoft.com/office/word/2010/wordprocessingCanvas" xmlns:cx="http://schemas.microsoft.com/office/drawing/2014/chartex" xmlns:cx1="http://schemas.microsoft.com/office/drawing/2015/9/8/chartex" xmlns:cx2="http://schemas.microsoft.com/office/drawing/2015/10/21/chartex" xmlns:cx3="http://schemas.microsoft.com/office/drawing/2016/5/9/chartex" xmlns:cx4="http://schemas.microsoft.com/office/drawing/2016/5/10/chartex" xmlns:cx5="http://schemas.microsoft.com/office/drawing/2016/5/11/chartex" xmlns:cx6="http://schemas.microsoft.com/office/drawing/2016/5/12/chartex" xmlns:cx7="http://schemas.microsoft.com/office/drawing/2016/5/13/chartex" xmlns:cx8="http://schemas.microsoft.com/office/drawing/2016/5/14/chartex" xmlns:mc="http://schemas.openxmlformats.org/markup-compatibility/2006" xmlns:aink="http://schemas.microsoft.com/office/drawing/2016/ink" xmlns:am3d="http://schemas.microsoft.com/office/drawing/2017/model3d" xmlns:o="urn:schemas-microsoft-com:office:office" xmlns:oel="http://schemas.microsoft.com/office/2019/extlst" xmlns:r="http://schemas.openxmlformats.org/officeDocument/2006/relationships" xmlns:m="http://schemas.openxmlformats.org/officeDocument/2006/math" xmlns:v="urn:schemas-microsoft-com:vml" xmlns:wp14="http://schemas.microsoft.com/office/word/2010/wordprocessingDrawing" xmlns:wp="http://schemas.openxmlformats.org/drawingml/2006/wordprocessingDrawing" xmlns:w10="urn:schemas-microsoft-com:office:word" xmlns:w="http://schemas.openxmlformats.org/wordprocessingml/2006/main" xmlns:w14="http://schemas.microsoft.com/office/word/2010/wordml" xmlns:w15="http://schemas.microsoft.com/office/word/2012/wordml" xmlns:w16cex="http://schemas.microsoft.com/office/word/2018/wordml/cex" xmlns:w16cid="http://schemas.microsoft.com/office/word/2016/wordml/cid" xmlns:w16="http://schemas.microsoft.com/office/word/2018/wordml" xmlns:w16du="http://schemas.microsoft.com/office/word/2023/wordml/word16du" xmlns:w16sdtdh="http://schemas.microsoft.com/office/word/2020/wordml/sdtdatahash" xmlns:w16sdtfl="http://schemas.microsoft.com/office/word/2024/wordml/sdtformatlock" xmlns:w16se="http://schemas.microsoft.com/office/word/2015/wordml/symex" xmlns:wpg="http://schemas.microsoft.com/office/word/2010/wordprocessingGroup" xmlns:wpi="http://schemas.microsoft.com/office/word/2010/wordprocessingInk" xmlns:wne="http://schemas.microsoft.com/office/word/2006/wordml" xmlns:wps="http://schemas.microsoft.com/office/word/2010/wordprocessingShape" mc:Ignorable="w14 w15 w16se w16cid w16 w16cex w16sdtdh w16sdtfl w16du wp14">
   <w:abstractNum w:abstractNumId="0" w15:restartNumberingAfterBreak="0">
-    <w:nsid w:val="0DCD29E8"/>
+    <w:nsid w:val="41203727"/>
     <w:multiLevelType w:val="hybridMultilevel"/>
-    <w:tmpl w:val="AD423E18"/>
-    <w:lvl w:ilvl="0" w:tplc="83DC3228">
+    <w:tmpl w:val="187EE0CA"/>
+    <w:lvl w:ilvl="0" w:tplc="62386862">
       <w:start w:val="1"/>
       <w:numFmt w:val="bullet"/>
-      <w:lvlText w:val="•"/>
+      <w:lvlText w:val="☐"/>
       <w:lvlJc w:val="left"/>
       <w:pPr>
-        <w:ind w:left="540" w:hanging="270"/>
+        <w:ind w:left="540" w:hanging="320"/>
       </w:pPr>
     </w:lvl>
-    <w:lvl w:ilvl="1" w:tplc="A6BE5832">
+    <w:lvl w:ilvl="1" w:tplc="F502D796">
       <w:numFmt w:val="decimal"/>
       <w:lvlText w:val=""/>
       <w:lvlJc w:val="left"/>
     </w:lvl>
-    <w:lvl w:ilvl="2" w:tplc="C936BED4">
+    <w:lvl w:ilvl="2" w:tplc="4D94868A">
       <w:numFmt w:val="decimal"/>
       <w:lvlText w:val=""/>
       <w:lvlJc w:val="left"/>
     </w:lvl>
-    <w:lvl w:ilvl="3" w:tplc="43B8663E">
+    <w:lvl w:ilvl="3" w:tplc="F7284696">
       <w:numFmt w:val="decimal"/>
       <w:lvlText w:val=""/>
       <w:lvlJc w:val="left"/>
     </w:lvl>
-    <w:lvl w:ilvl="4" w:tplc="E87C5CD6">
+    <w:lvl w:ilvl="4" w:tplc="74D6D308">
       <w:numFmt w:val="decimal"/>
       <w:lvlText w:val=""/>
       <w:lvlJc w:val="left"/>
     </w:lvl>
-    <w:lvl w:ilvl="5" w:tplc="DE923EBE">
+    <w:lvl w:ilvl="5" w:tplc="85522952">
       <w:numFmt w:val="decimal"/>
       <w:lvlText w:val=""/>
       <w:lvlJc w:val="left"/>
     </w:lvl>
-    <w:lvl w:ilvl="6" w:tplc="6D0CE3E2">
+    <w:lvl w:ilvl="6" w:tplc="7E0AE5AE">
       <w:numFmt w:val="decimal"/>
       <w:lvlText w:val=""/>
       <w:lvlJc w:val="left"/>
     </w:lvl>
-    <w:lvl w:ilvl="7" w:tplc="EFA29CD2">
+    <w:lvl w:ilvl="7" w:tplc="DA40411C">
       <w:numFmt w:val="decimal"/>
       <w:lvlText w:val=""/>
       <w:lvlJc w:val="left"/>
     </w:lvl>
-    <w:lvl w:ilvl="8" w:tplc="A45A9D96">
+    <w:lvl w:ilvl="8" w:tplc="38022904">
       <w:numFmt w:val="decimal"/>
       <w:lvlText w:val=""/>
       <w:lvlJc w:val="left"/>
     </w:lvl>
   </w:abstractNum>
   <w:abstractNum w:abstractNumId="1" w15:restartNumberingAfterBreak="0">
-    <w:nsid w:val="32C57C8C"/>
+    <w:nsid w:val="468110F2"/>
     <w:multiLevelType w:val="hybridMultilevel"/>
-    <w:tmpl w:val="961E8692"/>
-    <w:lvl w:ilvl="0" w:tplc="FCA88048">
+    <w:tmpl w:val="779625BC"/>
+    <w:lvl w:ilvl="0" w:tplc="F1083FF6">
       <w:start w:val="1"/>
-      <w:numFmt w:val="bullet"/>
-      <w:lvlText w:val="☐"/>
+      <w:numFmt w:val="decimal"/>
+      <w:lvlText w:val="%1."/>
       <w:lvlJc w:val="left"/>
       <w:pPr>
-        <w:ind w:left="540" w:hanging="320"/>
+        <w:ind w:left="540" w:hanging="360"/>
       </w:pPr>
     </w:lvl>
-    <w:lvl w:ilvl="1" w:tplc="AA703F28">
+    <w:lvl w:ilvl="1" w:tplc="56487C80">
       <w:numFmt w:val="decimal"/>
       <w:lvlText w:val=""/>
       <w:lvlJc w:val="left"/>
     </w:lvl>
-    <w:lvl w:ilvl="2" w:tplc="5A7CA440">
+    <w:lvl w:ilvl="2" w:tplc="C574687A">
       <w:numFmt w:val="decimal"/>
       <w:lvlText w:val=""/>
       <w:lvlJc w:val="left"/>
     </w:lvl>
-    <w:lvl w:ilvl="3" w:tplc="A5B8342C">
+    <w:lvl w:ilvl="3" w:tplc="B238862C">
       <w:numFmt w:val="decimal"/>
       <w:lvlText w:val=""/>
       <w:lvlJc w:val="left"/>
     </w:lvl>
-    <w:lvl w:ilvl="4" w:tplc="F94A4394">
+    <w:lvl w:ilvl="4" w:tplc="BD5CF300">
       <w:numFmt w:val="decimal"/>
       <w:lvlText w:val=""/>
       <w:lvlJc w:val="left"/>
     </w:lvl>
-    <w:lvl w:ilvl="5" w:tplc="05C2529C">
+    <w:lvl w:ilvl="5" w:tplc="C98C9DE4">
       <w:numFmt w:val="decimal"/>
       <w:lvlText w:val=""/>
       <w:lvlJc w:val="left"/>
     </w:lvl>
-    <w:lvl w:ilvl="6" w:tplc="826E4942">
+    <w:lvl w:ilvl="6" w:tplc="AFD04AF8">
       <w:numFmt w:val="decimal"/>
       <w:lvlText w:val=""/>
       <w:lvlJc w:val="left"/>
     </w:lvl>
-    <w:lvl w:ilvl="7" w:tplc="00620E0A">
+    <w:lvl w:ilvl="7" w:tplc="A37C56D6">
       <w:numFmt w:val="decimal"/>
       <w:lvlText w:val=""/>
       <w:lvlJc w:val="left"/>
     </w:lvl>
-    <w:lvl w:ilvl="8" w:tplc="F698D4E6">
+    <w:lvl w:ilvl="8" w:tplc="E6BC4828">
       <w:numFmt w:val="decimal"/>
       <w:lvlText w:val=""/>
       <w:lvlJc w:val="left"/>
     </w:lvl>
   </w:abstractNum>
   <w:abstractNum w:abstractNumId="2" w15:restartNumberingAfterBreak="0">
-    <w:nsid w:val="42561ABC"/>
+    <w:nsid w:val="5BE77FBA"/>
     <w:multiLevelType w:val="hybridMultilevel"/>
-    <w:tmpl w:val="B82CFDE8"/>
-    <w:lvl w:ilvl="0" w:tplc="61AEB4FA">
+    <w:tmpl w:val="CCC082D0"/>
+    <w:lvl w:ilvl="0" w:tplc="C922D8C8">
       <w:start w:val="1"/>
       <w:numFmt w:val="bullet"/>
       <w:lvlText w:val="●"/>
@@ -11675,7 +11471,7 @@
         <w:ind w:left="720" w:hanging="360"/>
       </w:pPr>
     </w:lvl>
-    <w:lvl w:ilvl="1" w:tplc="83D29E3A">
+    <w:lvl w:ilvl="1" w:tplc="28DA842A">
       <w:start w:val="1"/>
       <w:numFmt w:val="bullet"/>
       <w:lvlText w:val="○"/>
@@ -11684,7 +11480,7 @@
         <w:ind w:left="1440" w:hanging="360"/>
       </w:pPr>
     </w:lvl>
-    <w:lvl w:ilvl="2" w:tplc="C242DBE4">
+    <w:lvl w:ilvl="2" w:tplc="B754B562">
       <w:start w:val="1"/>
       <w:numFmt w:val="bullet"/>
       <w:lvlText w:val="■"/>
@@ -11693,7 +11489,7 @@
         <w:ind w:left="2160" w:hanging="360"/>
       </w:pPr>
     </w:lvl>
-    <w:lvl w:ilvl="3" w:tplc="59D6E076">
+    <w:lvl w:ilvl="3" w:tplc="1706A574">
       <w:start w:val="1"/>
       <w:numFmt w:val="bullet"/>
       <w:lvlText w:val="●"/>
@@ -11702,7 +11498,7 @@
         <w:ind w:left="2880" w:hanging="360"/>
       </w:pPr>
     </w:lvl>
-    <w:lvl w:ilvl="4" w:tplc="9B429D6A">
+    <w:lvl w:ilvl="4" w:tplc="EE14085C">
       <w:start w:val="1"/>
       <w:numFmt w:val="bullet"/>
       <w:lvlText w:val="○"/>
@@ -11711,7 +11507,7 @@
         <w:ind w:left="3600" w:hanging="360"/>
       </w:pPr>
     </w:lvl>
-    <w:lvl w:ilvl="5" w:tplc="69F07BF4">
+    <w:lvl w:ilvl="5" w:tplc="F8BAC38E">
       <w:start w:val="1"/>
       <w:numFmt w:val="bullet"/>
       <w:lvlText w:val="■"/>
@@ -11720,7 +11516,7 @@
         <w:ind w:left="4320" w:hanging="360"/>
       </w:pPr>
     </w:lvl>
-    <w:lvl w:ilvl="6" w:tplc="C5361F52">
+    <w:lvl w:ilvl="6" w:tplc="BC34BB62">
       <w:start w:val="1"/>
       <w:numFmt w:val="bullet"/>
       <w:lvlText w:val="●"/>
@@ -11729,7 +11525,7 @@
         <w:ind w:left="5040" w:hanging="360"/>
       </w:pPr>
     </w:lvl>
-    <w:lvl w:ilvl="7" w:tplc="F95E3E74">
+    <w:lvl w:ilvl="7" w:tplc="301E4134">
       <w:start w:val="1"/>
       <w:numFmt w:val="bullet"/>
       <w:lvlText w:val="●"/>
@@ -11738,7 +11534,7 @@
         <w:ind w:left="5760" w:hanging="360"/>
       </w:pPr>
     </w:lvl>
-    <w:lvl w:ilvl="8" w:tplc="48E4DD86">
+    <w:lvl w:ilvl="8" w:tplc="B964B652">
       <w:start w:val="1"/>
       <w:numFmt w:val="bullet"/>
       <w:lvlText w:val="●"/>
@@ -11749,79 +11545,79 @@
     </w:lvl>
   </w:abstractNum>
   <w:abstractNum w:abstractNumId="3" w15:restartNumberingAfterBreak="0">
-    <w:nsid w:val="6EEE6B95"/>
+    <w:nsid w:val="6EC662E5"/>
     <w:multiLevelType w:val="hybridMultilevel"/>
-    <w:tmpl w:val="F4EA564E"/>
-    <w:lvl w:ilvl="0" w:tplc="74961BD0">
+    <w:tmpl w:val="7AC2D3E6"/>
+    <w:lvl w:ilvl="0" w:tplc="99A8494C">
       <w:start w:val="1"/>
-      <w:numFmt w:val="decimal"/>
-      <w:lvlText w:val="%1."/>
+      <w:numFmt w:val="bullet"/>
+      <w:lvlText w:val="•"/>
       <w:lvlJc w:val="left"/>
       <w:pPr>
-        <w:ind w:left="540" w:hanging="360"/>
+        <w:ind w:left="540" w:hanging="270"/>
       </w:pPr>
     </w:lvl>
-    <w:lvl w:ilvl="1" w:tplc="7F4639F6">
+    <w:lvl w:ilvl="1" w:tplc="48A08C5C">
       <w:numFmt w:val="decimal"/>
       <w:lvlText w:val=""/>
       <w:lvlJc w:val="left"/>
     </w:lvl>
-    <w:lvl w:ilvl="2" w:tplc="218E8D34">
+    <w:lvl w:ilvl="2" w:tplc="26560CCA">
       <w:numFmt w:val="decimal"/>
       <w:lvlText w:val=""/>
       <w:lvlJc w:val="left"/>
     </w:lvl>
-    <w:lvl w:ilvl="3" w:tplc="93E08364">
+    <w:lvl w:ilvl="3" w:tplc="1BB65EF8">
       <w:numFmt w:val="decimal"/>
       <w:lvlText w:val=""/>
       <w:lvlJc w:val="left"/>
     </w:lvl>
-    <w:lvl w:ilvl="4" w:tplc="330804A8">
+    <w:lvl w:ilvl="4" w:tplc="D6DAF43C">
       <w:numFmt w:val="decimal"/>
       <w:lvlText w:val=""/>
       <w:lvlJc w:val="left"/>
     </w:lvl>
-    <w:lvl w:ilvl="5" w:tplc="19D8F106">
+    <w:lvl w:ilvl="5" w:tplc="39D29DFE">
       <w:numFmt w:val="decimal"/>
       <w:lvlText w:val=""/>
       <w:lvlJc w:val="left"/>
     </w:lvl>
-    <w:lvl w:ilvl="6" w:tplc="1AEE7E20">
+    <w:lvl w:ilvl="6" w:tplc="A9187924">
       <w:numFmt w:val="decimal"/>
       <w:lvlText w:val=""/>
       <w:lvlJc w:val="left"/>
     </w:lvl>
-    <w:lvl w:ilvl="7" w:tplc="2EEA2E56">
+    <w:lvl w:ilvl="7" w:tplc="F79A673A">
       <w:numFmt w:val="decimal"/>
       <w:lvlText w:val=""/>
       <w:lvlJc w:val="left"/>
     </w:lvl>
-    <w:lvl w:ilvl="8" w:tplc="03D8B9C8">
+    <w:lvl w:ilvl="8" w:tplc="A2F870D8">
       <w:numFmt w:val="decimal"/>
       <w:lvlText w:val=""/>
       <w:lvlJc w:val="left"/>
     </w:lvl>
   </w:abstractNum>
-  <w:num w:numId="1" w16cid:durableId="1097364345">
+  <w:num w:numId="1" w16cid:durableId="2071345208">
     <w:abstractNumId w:val="2"/>
     <w:lvlOverride w:ilvl="0">
       <w:startOverride w:val="1"/>
     </w:lvlOverride>
   </w:num>
-  <w:num w:numId="2" w16cid:durableId="1448621995">
-    <w:abstractNumId w:val="0"/>
-    <w:lvlOverride w:ilvl="0">
-      <w:startOverride w:val="1"/>
-    </w:lvlOverride>
-  </w:num>
-  <w:num w:numId="3" w16cid:durableId="558632405">
+  <w:num w:numId="2" w16cid:durableId="1496073824">
     <w:abstractNumId w:val="3"/>
     <w:lvlOverride w:ilvl="0">
       <w:startOverride w:val="1"/>
     </w:lvlOverride>
   </w:num>
-  <w:num w:numId="4" w16cid:durableId="2101758015">
+  <w:num w:numId="3" w16cid:durableId="2095974177">
     <w:abstractNumId w:val="1"/>
+    <w:lvlOverride w:ilvl="0">
+      <w:startOverride w:val="1"/>
+    </w:lvlOverride>
+  </w:num>
+  <w:num w:numId="4" w16cid:durableId="340817327">
+    <w:abstractNumId w:val="0"/>
     <w:lvlOverride w:ilvl="0">
       <w:startOverride w:val="1"/>
     </w:lvlOverride>
@@ -12441,7 +12237,7 @@
     <w:autoRedefine/>
     <w:uiPriority w:val="39"/>
     <w:unhideWhenUsed/>
-    <w:rsid w:val="00955E19"/>
+    <w:rsid w:val="00C61EB2"/>
     <w:pPr>
       <w:spacing w:after="100"/>
     </w:pPr>
@@ -12453,7 +12249,7 @@
     <w:autoRedefine/>
     <w:uiPriority w:val="39"/>
     <w:unhideWhenUsed/>
-    <w:rsid w:val="00955E19"/>
+    <w:rsid w:val="00C61EB2"/>
     <w:pPr>
       <w:spacing w:after="100"/>
       <w:ind w:left="210"/>

</xml_diff>